<commit_message>
docs: move pet showcase to proposal front
</commit_message>
<xml_diff>
--- a/docs/downloads/PetForge-Product-Proposal-Illustrated-2026-10-31.docx
+++ b/docs/downloads/PetForge-Product-Proposal-Illustrated-2026-10-31.docx
@@ -2,6 +2,1522 @@
 <file path=word/document.xml><?xml version="1.0" encoding="utf-8"?>
 <w:document xmlns:wpc="http://schemas.microsoft.com/office/word/2010/wordprocessingCanvas" xmlns:cx="http://schemas.microsoft.com/office/drawing/2014/chartex" xmlns:cx1="http://schemas.microsoft.com/office/drawing/2015/9/8/chartex" xmlns:cx2="http://schemas.microsoft.com/office/drawing/2015/10/21/chartex" xmlns:cx3="http://schemas.microsoft.com/office/drawing/2016/5/9/chartex" xmlns:cx4="http://schemas.microsoft.com/office/drawing/2016/5/10/chartex" xmlns:cx5="http://schemas.microsoft.com/office/drawing/2016/5/11/chartex" xmlns:cx6="http://schemas.microsoft.com/office/drawing/2016/5/12/chartex" xmlns:cx7="http://schemas.microsoft.com/office/drawing/2016/5/13/chartex" xmlns:cx8="http://schemas.microsoft.com/office/drawing/2016/5/14/chartex" xmlns:mc="http://schemas.openxmlformats.org/markup-compatibility/2006" xmlns:o="urn:schemas-microsoft-com:office:office" xmlns:r="http://schemas.openxmlformats.org/officeDocument/2006/relationships" xmlns:m="http://schemas.openxmlformats.org/officeDocument/2006/math" xmlns:v="urn:schemas-microsoft-com:vml" xmlns:wp14="http://schemas.microsoft.com/office/word/2010/wordprocessingDrawing" xmlns:wp="http://schemas.openxmlformats.org/drawingml/2006/wordprocessingDrawing" xmlns:w="http://schemas.openxmlformats.org/wordprocessingml/2006/main" xmlns:w14="http://schemas.microsoft.com/office/word/2010/wordml" xmlns:w10="urn:schemas-microsoft-com:office:word" xmlns:w15="http://schemas.microsoft.com/office/word/2012/wordml" xmlns:wpg="http://schemas.microsoft.com/office/word/2010/wordprocessingGroup" xmlns:wpi="http://schemas.microsoft.com/office/word/2010/wordprocessingInk" xmlns:wne="http://schemas.microsoft.com/office/word/2006/wordml" xmlns:wps="http://schemas.microsoft.com/office/word/2010/wordprocessingShape" xmlns:wpsCustomData="http://www.wps.cn/officeDocument/2013/wpsCustomData" mc:Ignorable="w14 w15 wp14">
   <w:body>
+    <w:p>
+      <w:pPr>
+        <w:pStyle w:val="3"/>
+      </w:pPr>
+      <w:r>
+        <w:t>我的桌宠从照片到角色</w:t>
+      </w:r>
+    </w:p>
+    <w:p>
+      <w:pPr>
+        <w:spacing w:after="160"/>
+      </w:pPr>
+      <w:r>
+        <w:t>我用最初的真人参考照片作为角色设计起点，保留双麻花辫、碎花上衣、浅色衣裙和棕色鞋子等外观特点，再把角色整理成适合桌面显示的完整立绘。</w:t>
+      </w:r>
+    </w:p>
+    <w:p>
+      <w:pPr>
+        <w:spacing w:after="200"/>
+      </w:pPr>
+      <w:r>
+        <w:t>这是一套由作者反复设计和微调的个人作品。照片对照用于展示这次创作结果，不代表任意用户上传照片后都能自动得到同等完成度。当前普通照片路线以本机抠图和轻量滤镜为主。</w:t>
+      </w:r>
+    </w:p>
+    <w:tbl>
+      <w:tblPr>
+        <w:tblW w:type="auto" w:w="0"/>
+        <w:jc w:val="center"/>
+        <w:tblLayout w:type="fixed"/>
+        <w:tblLook w:firstColumn="1" w:firstRow="1" w:lastColumn="0" w:lastRow="0" w:noHBand="0" w:noVBand="1" w:val="04A0"/>
+        <w:tblBorders>
+          <w:top w:val="single" w:sz="5" w:space="0" w:color="D9E2DC"/>
+          <w:left w:val="single" w:sz="5" w:space="0" w:color="D9E2DC"/>
+          <w:bottom w:val="single" w:sz="5" w:space="0" w:color="D9E2DC"/>
+          <w:right w:val="single" w:sz="5" w:space="0" w:color="D9E2DC"/>
+          <w:insideH w:val="single" w:sz="5" w:space="0" w:color="D9E2DC"/>
+          <w:insideV w:val="single" w:sz="5" w:space="0" w:color="D9E2DC"/>
+        </w:tblBorders>
+      </w:tblPr>
+      <w:tblGrid>
+        <w:gridCol w:w="4795"/>
+        <w:gridCol w:w="4795"/>
+      </w:tblGrid>
+      <w:tr>
+        <w:trPr>
+          <w:cantSplit/>
+        </w:trPr>
+        <w:tc>
+          <w:tcPr>
+            <w:tcW w:type="dxa" w:w="4795"/>
+            <w:vAlign w:val="center"/>
+            <w:shd w:fill="F7F8F4" w:val="clear"/>
+          </w:tcPr>
+          <w:p>
+            <w:pPr>
+              <w:spacing w:before="100" w:after="100"/>
+              <w:jc w:val="center"/>
+            </w:pPr>
+            <w:r>
+              <w:rPr>
+                <w:b/>
+                <w:color w:val="2B675B"/>
+                <w:sz w:val="22"/>
+              </w:rPr>
+              <w:t>原始真人参考照片</w:t>
+            </w:r>
+          </w:p>
+        </w:tc>
+        <w:tc>
+          <w:tcPr>
+            <w:tcW w:type="dxa" w:w="4795"/>
+            <w:vAlign w:val="center"/>
+            <w:shd w:fill="F7F8F4" w:val="clear"/>
+          </w:tcPr>
+          <w:p>
+            <w:pPr>
+              <w:spacing w:before="100" w:after="100"/>
+              <w:jc w:val="center"/>
+            </w:pPr>
+            <w:r>
+              <w:rPr>
+                <w:b/>
+                <w:color w:val="2B675B"/>
+                <w:sz w:val="22"/>
+              </w:rPr>
+              <w:t>PetForge 卡通桌宠</w:t>
+            </w:r>
+          </w:p>
+        </w:tc>
+      </w:tr>
+      <w:tr>
+        <w:trPr>
+          <w:cantSplit/>
+        </w:trPr>
+        <w:tc>
+          <w:tcPr>
+            <w:tcW w:type="dxa" w:w="4795"/>
+            <w:vAlign w:val="center"/>
+            <w:shd w:fill="F7F8F4" w:val="clear"/>
+          </w:tcPr>
+          <w:p>
+            <w:pPr>
+              <w:spacing w:before="40" w:after="40"/>
+              <w:jc w:val="center"/>
+            </w:pPr>
+            <w:r>
+              <w:drawing>
+                <wp:inline xmlns:a="http://schemas.openxmlformats.org/drawingml/2006/main" xmlns:pic="http://schemas.openxmlformats.org/drawingml/2006/picture">
+                  <wp:extent cx="2500563" cy="3337560"/>
+                  <wp:docPr id="3" name="Picture 3" title="作者授权展示的真人参考照片" descr="照片中的人物梳双麻花辫，穿碎花上衣和浅色衣裙，站在花墙前。"/>
+                  <wp:cNvGraphicFramePr>
+                    <a:graphicFrameLocks noChangeAspect="1"/>
+                  </wp:cNvGraphicFramePr>
+                  <a:graphic>
+                    <a:graphicData uri="http://schemas.openxmlformats.org/drawingml/2006/picture">
+                      <pic:pic>
+                        <pic:nvPicPr>
+                          <pic:cNvPr id="0" name="reference-photo.jpg"/>
+                          <pic:cNvPicPr/>
+                        </pic:nvPicPr>
+                        <pic:blipFill>
+                          <a:blip r:embed="rId13"/>
+                          <a:stretch>
+                            <a:fillRect/>
+                          </a:stretch>
+                        </pic:blipFill>
+                        <pic:spPr>
+                          <a:xfrm>
+                            <a:off x="0" y="0"/>
+                            <a:ext cx="2500563" cy="3337560"/>
+                          </a:xfrm>
+                          <a:prstGeom prst="rect"/>
+                        </pic:spPr>
+                      </pic:pic>
+                    </a:graphicData>
+                  </a:graphic>
+                </wp:inline>
+              </w:drawing>
+            </w:r>
+          </w:p>
+        </w:tc>
+        <w:tc>
+          <w:tcPr>
+            <w:tcW w:type="dxa" w:w="4795"/>
+            <w:vAlign w:val="center"/>
+            <w:shd w:fill="F7F8F4" w:val="clear"/>
+          </w:tcPr>
+          <w:p>
+            <w:pPr>
+              <w:spacing w:before="40" w:after="40"/>
+              <w:jc w:val="center"/>
+            </w:pPr>
+            <w:r>
+              <w:drawing>
+                <wp:inline xmlns:a="http://schemas.openxmlformats.org/drawingml/2006/main" xmlns:pic="http://schemas.openxmlformats.org/drawingml/2006/picture">
+                  <wp:extent cx="1780032" cy="3337560"/>
+                  <wp:docPr id="4" name="Picture 4" title="根据参考照片设计的桌宠角色" descr="全身卡通女孩桌宠，保留双麻花辫、碎花上衣、浅色衣裙和棕色鞋子。"/>
+                  <wp:cNvGraphicFramePr>
+                    <a:graphicFrameLocks noChangeAspect="1"/>
+                  </wp:cNvGraphicFramePr>
+                  <a:graphic>
+                    <a:graphicData uri="http://schemas.openxmlformats.org/drawingml/2006/picture">
+                      <pic:pic>
+                        <pic:nvPicPr>
+                          <pic:cNvPr id="0" name="idle-portrait.png"/>
+                          <pic:cNvPicPr/>
+                        </pic:nvPicPr>
+                        <pic:blipFill>
+                          <a:blip r:embed="rId14"/>
+                          <a:stretch>
+                            <a:fillRect/>
+                          </a:stretch>
+                        </pic:blipFill>
+                        <pic:spPr>
+                          <a:xfrm>
+                            <a:off x="0" y="0"/>
+                            <a:ext cx="1780032" cy="3337560"/>
+                          </a:xfrm>
+                          <a:prstGeom prst="rect"/>
+                        </pic:spPr>
+                      </pic:pic>
+                    </a:graphicData>
+                  </a:graphic>
+                </wp:inline>
+              </w:drawing>
+            </w:r>
+          </w:p>
+        </w:tc>
+      </w:tr>
+      <w:tr>
+        <w:trPr>
+          <w:cantSplit/>
+        </w:trPr>
+        <w:tc>
+          <w:tcPr>
+            <w:tcW w:type="dxa" w:w="4795"/>
+            <w:vAlign w:val="center"/>
+            <w:shd w:fill="F7F8F4" w:val="clear"/>
+          </w:tcPr>
+          <w:p/>
+          <w:p>
+            <w:pPr>
+              <w:spacing w:before="20" w:after="80"/>
+              <w:jc w:val="center"/>
+            </w:pPr>
+            <w:r>
+              <w:rPr>
+                <w:b/>
+                <w:color w:val="31594F"/>
+                <w:sz w:val="21"/>
+              </w:rPr>
+              <w:t>用于观察发型、服装和整体气质</w:t>
+            </w:r>
+          </w:p>
+        </w:tc>
+        <w:tc>
+          <w:tcPr>
+            <w:tcW w:type="dxa" w:w="4795"/>
+            <w:vAlign w:val="center"/>
+            <w:shd w:fill="F7F8F4" w:val="clear"/>
+          </w:tcPr>
+          <w:p/>
+          <w:p>
+            <w:pPr>
+              <w:spacing w:before="20" w:after="80"/>
+              <w:jc w:val="center"/>
+            </w:pPr>
+            <w:r>
+              <w:rPr>
+                <w:b/>
+                <w:color w:val="31594F"/>
+                <w:sz w:val="21"/>
+              </w:rPr>
+              <w:t>人工设计后继续调整外观与动作</w:t>
+            </w:r>
+          </w:p>
+        </w:tc>
+      </w:tr>
+    </w:tbl>
+    <w:p>
+      <w:pPr>
+        <w:pStyle w:val="15"/>
+        <w:spacing w:before="160"/>
+        <w:jc w:val="center"/>
+      </w:pPr>
+      <w:r>
+        <w:t>图 3  作者授权展示的参考照片与完成后的桌宠立绘。其他用户的照片和生成中间稿仍留在本机，不会自动进入公开示例。</w:t>
+      </w:r>
+    </w:p>
+    <w:p>
+      <w:r>
+        <w:br w:type="page"/>
+      </w:r>
+    </w:p>
+    <w:p>
+      <w:pPr>
+        <w:pStyle w:val="3"/>
+      </w:pPr>
+      <w:r>
+        <w:t>动作图册一：日常状态与移动</w:t>
+      </w:r>
+    </w:p>
+    <w:p>
+      <w:pPr>
+        <w:spacing w:after="160"/>
+      </w:pPr>
+      <w:r>
+        <w:t>包括待机、等待、眨眼、睡觉和左右跑动。</w:t>
+      </w:r>
+    </w:p>
+    <w:p>
+      <w:pPr>
+        <w:spacing w:after="200"/>
+      </w:pPr>
+      <w:r>
+        <w:t>下面展示的是我为这套示例角色制作和调整的 18 张动作图。每项动作都能单独预览和修改；新上传的照片不会自动继承这些专属动作。</w:t>
+      </w:r>
+    </w:p>
+    <w:tbl>
+      <w:tblPr>
+        <w:tblW w:type="auto" w:w="0"/>
+        <w:jc w:val="center"/>
+        <w:tblLayout w:type="fixed"/>
+        <w:tblLook w:firstColumn="1" w:firstRow="1" w:lastColumn="0" w:lastRow="0" w:noHBand="0" w:noVBand="1" w:val="04A0"/>
+        <w:tblBorders>
+          <w:top w:val="single" w:sz="5" w:space="0" w:color="E0DAD2"/>
+          <w:left w:val="single" w:sz="5" w:space="0" w:color="E0DAD2"/>
+          <w:bottom w:val="single" w:sz="5" w:space="0" w:color="E0DAD2"/>
+          <w:right w:val="single" w:sz="5" w:space="0" w:color="E0DAD2"/>
+          <w:insideH w:val="single" w:sz="5" w:space="0" w:color="E0DAD2"/>
+          <w:insideV w:val="single" w:sz="5" w:space="0" w:color="E0DAD2"/>
+        </w:tblBorders>
+      </w:tblPr>
+      <w:tblGrid>
+        <w:gridCol w:w="3254"/>
+        <w:gridCol w:w="3254"/>
+        <w:gridCol w:w="3254"/>
+      </w:tblGrid>
+      <w:tr>
+        <w:trPr>
+          <w:cantSplit/>
+        </w:trPr>
+        <w:tc>
+          <w:tcPr>
+            <w:tcW w:type="dxa" w:w="3254"/>
+            <w:vAlign w:val="center"/>
+            <w:shd w:fill="FBF9F4" w:val="clear"/>
+          </w:tcPr>
+          <w:p>
+            <w:pPr>
+              <w:spacing w:before="40" w:after="40"/>
+              <w:jc w:val="center"/>
+            </w:pPr>
+            <w:r>
+              <w:drawing>
+                <wp:inline xmlns:a="http://schemas.openxmlformats.org/drawingml/2006/main" xmlns:pic="http://schemas.openxmlformats.org/drawingml/2006/picture">
+                  <wp:extent cx="902208" cy="1691640"/>
+                  <wp:docPr id="5" name="Picture 5" title="01 安静待机" descr="PetForge 示例桌宠动作：安静待机。"/>
+                  <wp:cNvGraphicFramePr>
+                    <a:graphicFrameLocks noChangeAspect="1"/>
+                  </wp:cNvGraphicFramePr>
+                  <a:graphic>
+                    <a:graphicData uri="http://schemas.openxmlformats.org/drawingml/2006/picture">
+                      <pic:pic>
+                        <pic:nvPicPr>
+                          <pic:cNvPr id="0" name="idle-portrait.png"/>
+                          <pic:cNvPicPr/>
+                        </pic:nvPicPr>
+                        <pic:blipFill>
+                          <a:blip r:embed="rId14"/>
+                          <a:stretch>
+                            <a:fillRect/>
+                          </a:stretch>
+                        </pic:blipFill>
+                        <pic:spPr>
+                          <a:xfrm>
+                            <a:off x="0" y="0"/>
+                            <a:ext cx="902208" cy="1691640"/>
+                          </a:xfrm>
+                          <a:prstGeom prst="rect"/>
+                        </pic:spPr>
+                      </pic:pic>
+                    </a:graphicData>
+                  </a:graphic>
+                </wp:inline>
+              </w:drawing>
+            </w:r>
+          </w:p>
+          <w:p>
+            <w:pPr>
+              <w:spacing w:before="20" w:after="80"/>
+              <w:jc w:val="center"/>
+            </w:pPr>
+            <w:r>
+              <w:rPr>
+                <w:b/>
+                <w:color w:val="31594F"/>
+                <w:sz w:val="19"/>
+              </w:rPr>
+              <w:t>01  安静待机</w:t>
+            </w:r>
+          </w:p>
+        </w:tc>
+        <w:tc>
+          <w:tcPr>
+            <w:tcW w:type="dxa" w:w="3254"/>
+            <w:vAlign w:val="center"/>
+            <w:shd w:fill="FBF9F4" w:val="clear"/>
+          </w:tcPr>
+          <w:p>
+            <w:pPr>
+              <w:spacing w:before="40" w:after="40"/>
+              <w:jc w:val="center"/>
+            </w:pPr>
+            <w:r>
+              <w:drawing>
+                <wp:inline xmlns:a="http://schemas.openxmlformats.org/drawingml/2006/main" xmlns:pic="http://schemas.openxmlformats.org/drawingml/2006/picture">
+                  <wp:extent cx="1748238" cy="1691640"/>
+                  <wp:docPr id="6" name="Picture 6" title="02 等待输入" descr="PetForge 示例桌宠动作：等待输入。"/>
+                  <wp:cNvGraphicFramePr>
+                    <a:graphicFrameLocks noChangeAspect="1"/>
+                  </wp:cNvGraphicFramePr>
+                  <a:graphic>
+                    <a:graphicData uri="http://schemas.openxmlformats.org/drawingml/2006/picture">
+                      <pic:pic>
+                        <pic:nvPicPr>
+                          <pic:cNvPr id="0" name="waiting.png"/>
+                          <pic:cNvPicPr/>
+                        </pic:nvPicPr>
+                        <pic:blipFill>
+                          <a:blip r:embed="rId15"/>
+                          <a:stretch>
+                            <a:fillRect/>
+                          </a:stretch>
+                        </pic:blipFill>
+                        <pic:spPr>
+                          <a:xfrm>
+                            <a:off x="0" y="0"/>
+                            <a:ext cx="1748238" cy="1691640"/>
+                          </a:xfrm>
+                          <a:prstGeom prst="rect"/>
+                        </pic:spPr>
+                      </pic:pic>
+                    </a:graphicData>
+                  </a:graphic>
+                </wp:inline>
+              </w:drawing>
+            </w:r>
+          </w:p>
+          <w:p>
+            <w:pPr>
+              <w:spacing w:before="20" w:after="80"/>
+              <w:jc w:val="center"/>
+            </w:pPr>
+            <w:r>
+              <w:rPr>
+                <w:b/>
+                <w:color w:val="31594F"/>
+                <w:sz w:val="19"/>
+              </w:rPr>
+              <w:t>02  等待输入</w:t>
+            </w:r>
+          </w:p>
+        </w:tc>
+        <w:tc>
+          <w:tcPr>
+            <w:tcW w:type="dxa" w:w="3254"/>
+            <w:vAlign w:val="center"/>
+            <w:shd w:fill="FBF9F4" w:val="clear"/>
+          </w:tcPr>
+          <w:p>
+            <w:pPr>
+              <w:spacing w:before="40" w:after="40"/>
+              <w:jc w:val="center"/>
+            </w:pPr>
+            <w:r>
+              <w:drawing>
+                <wp:inline xmlns:a="http://schemas.openxmlformats.org/drawingml/2006/main" xmlns:pic="http://schemas.openxmlformats.org/drawingml/2006/picture">
+                  <wp:extent cx="902208" cy="1691640"/>
+                  <wp:docPr id="7" name="Picture 7" title="03 眨眼微笑" descr="PetForge 示例桌宠动作：眨眼微笑。"/>
+                  <wp:cNvGraphicFramePr>
+                    <a:graphicFrameLocks noChangeAspect="1"/>
+                  </wp:cNvGraphicFramePr>
+                  <a:graphic>
+                    <a:graphicData uri="http://schemas.openxmlformats.org/drawingml/2006/picture">
+                      <pic:pic>
+                        <pic:nvPicPr>
+                          <pic:cNvPr id="0" name="blink.png"/>
+                          <pic:cNvPicPr/>
+                        </pic:nvPicPr>
+                        <pic:blipFill>
+                          <a:blip r:embed="rId16"/>
+                          <a:stretch>
+                            <a:fillRect/>
+                          </a:stretch>
+                        </pic:blipFill>
+                        <pic:spPr>
+                          <a:xfrm>
+                            <a:off x="0" y="0"/>
+                            <a:ext cx="902208" cy="1691640"/>
+                          </a:xfrm>
+                          <a:prstGeom prst="rect"/>
+                        </pic:spPr>
+                      </pic:pic>
+                    </a:graphicData>
+                  </a:graphic>
+                </wp:inline>
+              </w:drawing>
+            </w:r>
+          </w:p>
+          <w:p>
+            <w:pPr>
+              <w:spacing w:before="20" w:after="80"/>
+              <w:jc w:val="center"/>
+            </w:pPr>
+            <w:r>
+              <w:rPr>
+                <w:b/>
+                <w:color w:val="31594F"/>
+                <w:sz w:val="19"/>
+              </w:rPr>
+              <w:t>03  眨眼微笑</w:t>
+            </w:r>
+          </w:p>
+        </w:tc>
+      </w:tr>
+      <w:tr>
+        <w:trPr>
+          <w:cantSplit/>
+        </w:trPr>
+        <w:tc>
+          <w:tcPr>
+            <w:tcW w:type="dxa" w:w="3254"/>
+            <w:vAlign w:val="center"/>
+            <w:shd w:fill="FBF9F4" w:val="clear"/>
+          </w:tcPr>
+          <w:p>
+            <w:pPr>
+              <w:spacing w:before="40" w:after="40"/>
+              <w:jc w:val="center"/>
+            </w:pPr>
+            <w:r>
+              <w:drawing>
+                <wp:inline xmlns:a="http://schemas.openxmlformats.org/drawingml/2006/main" xmlns:pic="http://schemas.openxmlformats.org/drawingml/2006/picture">
+                  <wp:extent cx="1748238" cy="1691640"/>
+                  <wp:docPr id="8" name="Picture 8" title="04 睡觉" descr="PetForge 示例桌宠动作：睡觉。"/>
+                  <wp:cNvGraphicFramePr>
+                    <a:graphicFrameLocks noChangeAspect="1"/>
+                  </wp:cNvGraphicFramePr>
+                  <a:graphic>
+                    <a:graphicData uri="http://schemas.openxmlformats.org/drawingml/2006/picture">
+                      <pic:pic>
+                        <pic:nvPicPr>
+                          <pic:cNvPr id="0" name="sleep.png"/>
+                          <pic:cNvPicPr/>
+                        </pic:nvPicPr>
+                        <pic:blipFill>
+                          <a:blip r:embed="rId17"/>
+                          <a:stretch>
+                            <a:fillRect/>
+                          </a:stretch>
+                        </pic:blipFill>
+                        <pic:spPr>
+                          <a:xfrm>
+                            <a:off x="0" y="0"/>
+                            <a:ext cx="1748238" cy="1691640"/>
+                          </a:xfrm>
+                          <a:prstGeom prst="rect"/>
+                        </pic:spPr>
+                      </pic:pic>
+                    </a:graphicData>
+                  </a:graphic>
+                </wp:inline>
+              </w:drawing>
+            </w:r>
+          </w:p>
+          <w:p>
+            <w:pPr>
+              <w:spacing w:before="20" w:after="80"/>
+              <w:jc w:val="center"/>
+            </w:pPr>
+            <w:r>
+              <w:rPr>
+                <w:b/>
+                <w:color w:val="31594F"/>
+                <w:sz w:val="19"/>
+              </w:rPr>
+              <w:t>04  睡觉</w:t>
+            </w:r>
+          </w:p>
+        </w:tc>
+        <w:tc>
+          <w:tcPr>
+            <w:tcW w:type="dxa" w:w="3254"/>
+            <w:vAlign w:val="center"/>
+            <w:shd w:fill="FBF9F4" w:val="clear"/>
+          </w:tcPr>
+          <w:p>
+            <w:pPr>
+              <w:spacing w:before="40" w:after="40"/>
+              <w:jc w:val="center"/>
+            </w:pPr>
+            <w:r>
+              <w:drawing>
+                <wp:inline xmlns:a="http://schemas.openxmlformats.org/drawingml/2006/main" xmlns:pic="http://schemas.openxmlformats.org/drawingml/2006/picture">
+                  <wp:extent cx="1774835" cy="1691640"/>
+                  <wp:docPr id="9" name="Picture 9" title="05 向左跑" descr="PetForge 示例桌宠动作：向左跑。"/>
+                  <wp:cNvGraphicFramePr>
+                    <a:graphicFrameLocks noChangeAspect="1"/>
+                  </wp:cNvGraphicFramePr>
+                  <a:graphic>
+                    <a:graphicData uri="http://schemas.openxmlformats.org/drawingml/2006/picture">
+                      <pic:pic>
+                        <pic:nvPicPr>
+                          <pic:cNvPr id="0" name="run-left.png"/>
+                          <pic:cNvPicPr/>
+                        </pic:nvPicPr>
+                        <pic:blipFill>
+                          <a:blip r:embed="rId18"/>
+                          <a:stretch>
+                            <a:fillRect/>
+                          </a:stretch>
+                        </pic:blipFill>
+                        <pic:spPr>
+                          <a:xfrm>
+                            <a:off x="0" y="0"/>
+                            <a:ext cx="1774835" cy="1691640"/>
+                          </a:xfrm>
+                          <a:prstGeom prst="rect"/>
+                        </pic:spPr>
+                      </pic:pic>
+                    </a:graphicData>
+                  </a:graphic>
+                </wp:inline>
+              </w:drawing>
+            </w:r>
+          </w:p>
+          <w:p>
+            <w:pPr>
+              <w:spacing w:before="20" w:after="80"/>
+              <w:jc w:val="center"/>
+            </w:pPr>
+            <w:r>
+              <w:rPr>
+                <w:b/>
+                <w:color w:val="31594F"/>
+                <w:sz w:val="19"/>
+              </w:rPr>
+              <w:t>05  向左跑</w:t>
+            </w:r>
+          </w:p>
+        </w:tc>
+        <w:tc>
+          <w:tcPr>
+            <w:tcW w:type="dxa" w:w="3254"/>
+            <w:vAlign w:val="center"/>
+            <w:shd w:fill="FBF9F4" w:val="clear"/>
+          </w:tcPr>
+          <w:p>
+            <w:pPr>
+              <w:spacing w:before="40" w:after="40"/>
+              <w:jc w:val="center"/>
+            </w:pPr>
+            <w:r>
+              <w:drawing>
+                <wp:inline xmlns:a="http://schemas.openxmlformats.org/drawingml/2006/main" xmlns:pic="http://schemas.openxmlformats.org/drawingml/2006/picture">
+                  <wp:extent cx="1774835" cy="1691640"/>
+                  <wp:docPr id="10" name="Picture 10" title="06 向右跑" descr="PetForge 示例桌宠动作：向右跑。"/>
+                  <wp:cNvGraphicFramePr>
+                    <a:graphicFrameLocks noChangeAspect="1"/>
+                  </wp:cNvGraphicFramePr>
+                  <a:graphic>
+                    <a:graphicData uri="http://schemas.openxmlformats.org/drawingml/2006/picture">
+                      <pic:pic>
+                        <pic:nvPicPr>
+                          <pic:cNvPr id="0" name="run-right.png"/>
+                          <pic:cNvPicPr/>
+                        </pic:nvPicPr>
+                        <pic:blipFill>
+                          <a:blip r:embed="rId19"/>
+                          <a:stretch>
+                            <a:fillRect/>
+                          </a:stretch>
+                        </pic:blipFill>
+                        <pic:spPr>
+                          <a:xfrm>
+                            <a:off x="0" y="0"/>
+                            <a:ext cx="1774835" cy="1691640"/>
+                          </a:xfrm>
+                          <a:prstGeom prst="rect"/>
+                        </pic:spPr>
+                      </pic:pic>
+                    </a:graphicData>
+                  </a:graphic>
+                </wp:inline>
+              </w:drawing>
+            </w:r>
+          </w:p>
+          <w:p>
+            <w:pPr>
+              <w:spacing w:before="20" w:after="80"/>
+              <w:jc w:val="center"/>
+            </w:pPr>
+            <w:r>
+              <w:rPr>
+                <w:b/>
+                <w:color w:val="31594F"/>
+                <w:sz w:val="19"/>
+              </w:rPr>
+              <w:t>06  向右跑</w:t>
+            </w:r>
+          </w:p>
+        </w:tc>
+      </w:tr>
+    </w:tbl>
+    <w:p>
+      <w:r>
+        <w:br w:type="page"/>
+      </w:r>
+    </w:p>
+    <w:p>
+      <w:pPr>
+        <w:pStyle w:val="3"/>
+      </w:pPr>
+      <w:r>
+        <w:t>动作图册二：问候和日常小动作</w:t>
+      </w:r>
+    </w:p>
+    <w:p>
+      <w:pPr>
+        <w:spacing w:after="160"/>
+      </w:pPr>
+      <w:r>
+        <w:t>包括招手微笑、整理头发、照镜子和思考等动作。</w:t>
+      </w:r>
+    </w:p>
+    <w:tbl>
+      <w:tblPr>
+        <w:tblW w:type="auto" w:w="0"/>
+        <w:jc w:val="center"/>
+        <w:tblLayout w:type="fixed"/>
+        <w:tblLook w:firstColumn="1" w:firstRow="1" w:lastColumn="0" w:lastRow="0" w:noHBand="0" w:noVBand="1" w:val="04A0"/>
+        <w:tblBorders>
+          <w:top w:val="single" w:sz="5" w:space="0" w:color="E0DAD2"/>
+          <w:left w:val="single" w:sz="5" w:space="0" w:color="E0DAD2"/>
+          <w:bottom w:val="single" w:sz="5" w:space="0" w:color="E0DAD2"/>
+          <w:right w:val="single" w:sz="5" w:space="0" w:color="E0DAD2"/>
+          <w:insideH w:val="single" w:sz="5" w:space="0" w:color="E0DAD2"/>
+          <w:insideV w:val="single" w:sz="5" w:space="0" w:color="E0DAD2"/>
+        </w:tblBorders>
+      </w:tblPr>
+      <w:tblGrid>
+        <w:gridCol w:w="3254"/>
+        <w:gridCol w:w="3254"/>
+        <w:gridCol w:w="3254"/>
+      </w:tblGrid>
+      <w:tr>
+        <w:trPr>
+          <w:cantSplit/>
+        </w:trPr>
+        <w:tc>
+          <w:tcPr>
+            <w:tcW w:type="dxa" w:w="3254"/>
+            <w:vAlign w:val="center"/>
+            <w:shd w:fill="FBF9F4" w:val="clear"/>
+          </w:tcPr>
+          <w:p>
+            <w:pPr>
+              <w:spacing w:before="40" w:after="40"/>
+              <w:jc w:val="center"/>
+            </w:pPr>
+            <w:r>
+              <w:drawing>
+                <wp:inline xmlns:a="http://schemas.openxmlformats.org/drawingml/2006/main" xmlns:pic="http://schemas.openxmlformats.org/drawingml/2006/picture">
+                  <wp:extent cx="1748238" cy="1691640"/>
+                  <wp:docPr id="11" name="Picture 11" title="07 招手微笑（手边小爱心）" descr="PetForge 示例桌宠动作：招手微笑（手边小爱心）。"/>
+                  <wp:cNvGraphicFramePr>
+                    <a:graphicFrameLocks noChangeAspect="1"/>
+                  </wp:cNvGraphicFramePr>
+                  <a:graphic>
+                    <a:graphicData uri="http://schemas.openxmlformats.org/drawingml/2006/picture">
+                      <pic:pic>
+                        <pic:nvPicPr>
+                          <pic:cNvPr id="0" name="wave-heart.png"/>
+                          <pic:cNvPicPr/>
+                        </pic:nvPicPr>
+                        <pic:blipFill>
+                          <a:blip r:embed="rId20"/>
+                          <a:stretch>
+                            <a:fillRect/>
+                          </a:stretch>
+                        </pic:blipFill>
+                        <pic:spPr>
+                          <a:xfrm>
+                            <a:off x="0" y="0"/>
+                            <a:ext cx="1748238" cy="1691640"/>
+                          </a:xfrm>
+                          <a:prstGeom prst="rect"/>
+                        </pic:spPr>
+                      </pic:pic>
+                    </a:graphicData>
+                  </a:graphic>
+                </wp:inline>
+              </w:drawing>
+            </w:r>
+          </w:p>
+          <w:p>
+            <w:pPr>
+              <w:spacing w:before="20" w:after="80"/>
+              <w:jc w:val="center"/>
+            </w:pPr>
+            <w:r>
+              <w:rPr>
+                <w:b/>
+                <w:color w:val="31594F"/>
+                <w:sz w:val="19"/>
+              </w:rPr>
+              <w:t>07  招手微笑（手边小爱心）</w:t>
+            </w:r>
+          </w:p>
+        </w:tc>
+        <w:tc>
+          <w:tcPr>
+            <w:tcW w:type="dxa" w:w="3254"/>
+            <w:vAlign w:val="center"/>
+            <w:shd w:fill="FBF9F4" w:val="clear"/>
+          </w:tcPr>
+          <w:p>
+            <w:pPr>
+              <w:spacing w:before="40" w:after="40"/>
+              <w:jc w:val="center"/>
+            </w:pPr>
+            <w:r>
+              <w:drawing>
+                <wp:inline xmlns:a="http://schemas.openxmlformats.org/drawingml/2006/main" xmlns:pic="http://schemas.openxmlformats.org/drawingml/2006/picture">
+                  <wp:extent cx="1748238" cy="1691640"/>
+                  <wp:docPr id="12" name="Picture 12" title="08 开心微笑" descr="PetForge 示例桌宠动作：开心微笑。"/>
+                  <wp:cNvGraphicFramePr>
+                    <a:graphicFrameLocks noChangeAspect="1"/>
+                  </wp:cNvGraphicFramePr>
+                  <a:graphic>
+                    <a:graphicData uri="http://schemas.openxmlformats.org/drawingml/2006/picture">
+                      <pic:pic>
+                        <pic:nvPicPr>
+                          <pic:cNvPr id="0" name="happy.png"/>
+                          <pic:cNvPicPr/>
+                        </pic:nvPicPr>
+                        <pic:blipFill>
+                          <a:blip r:embed="rId21"/>
+                          <a:stretch>
+                            <a:fillRect/>
+                          </a:stretch>
+                        </pic:blipFill>
+                        <pic:spPr>
+                          <a:xfrm>
+                            <a:off x="0" y="0"/>
+                            <a:ext cx="1748238" cy="1691640"/>
+                          </a:xfrm>
+                          <a:prstGeom prst="rect"/>
+                        </pic:spPr>
+                      </pic:pic>
+                    </a:graphicData>
+                  </a:graphic>
+                </wp:inline>
+              </w:drawing>
+            </w:r>
+          </w:p>
+          <w:p>
+            <w:pPr>
+              <w:spacing w:before="20" w:after="80"/>
+              <w:jc w:val="center"/>
+            </w:pPr>
+            <w:r>
+              <w:rPr>
+                <w:b/>
+                <w:color w:val="31594F"/>
+                <w:sz w:val="19"/>
+              </w:rPr>
+              <w:t>08  开心微笑</w:t>
+            </w:r>
+          </w:p>
+        </w:tc>
+        <w:tc>
+          <w:tcPr>
+            <w:tcW w:type="dxa" w:w="3254"/>
+            <w:vAlign w:val="center"/>
+            <w:shd w:fill="FBF9F4" w:val="clear"/>
+          </w:tcPr>
+          <w:p>
+            <w:pPr>
+              <w:spacing w:before="40" w:after="40"/>
+              <w:jc w:val="center"/>
+            </w:pPr>
+            <w:r>
+              <w:drawing>
+                <wp:inline xmlns:a="http://schemas.openxmlformats.org/drawingml/2006/main" xmlns:pic="http://schemas.openxmlformats.org/drawingml/2006/picture">
+                  <wp:extent cx="1748238" cy="1691640"/>
+                  <wp:docPr id="13" name="Picture 13" title="09 点头致意" descr="PetForge 示例桌宠动作：点头致意。"/>
+                  <wp:cNvGraphicFramePr>
+                    <a:graphicFrameLocks noChangeAspect="1"/>
+                  </wp:cNvGraphicFramePr>
+                  <a:graphic>
+                    <a:graphicData uri="http://schemas.openxmlformats.org/drawingml/2006/picture">
+                      <pic:pic>
+                        <pic:nvPicPr>
+                          <pic:cNvPr id="0" name="bow.png"/>
+                          <pic:cNvPicPr/>
+                        </pic:nvPicPr>
+                        <pic:blipFill>
+                          <a:blip r:embed="rId22"/>
+                          <a:stretch>
+                            <a:fillRect/>
+                          </a:stretch>
+                        </pic:blipFill>
+                        <pic:spPr>
+                          <a:xfrm>
+                            <a:off x="0" y="0"/>
+                            <a:ext cx="1748238" cy="1691640"/>
+                          </a:xfrm>
+                          <a:prstGeom prst="rect"/>
+                        </pic:spPr>
+                      </pic:pic>
+                    </a:graphicData>
+                  </a:graphic>
+                </wp:inline>
+              </w:drawing>
+            </w:r>
+          </w:p>
+          <w:p>
+            <w:pPr>
+              <w:spacing w:before="20" w:after="80"/>
+              <w:jc w:val="center"/>
+            </w:pPr>
+            <w:r>
+              <w:rPr>
+                <w:b/>
+                <w:color w:val="31594F"/>
+                <w:sz w:val="19"/>
+              </w:rPr>
+              <w:t>09  点头致意</w:t>
+            </w:r>
+          </w:p>
+        </w:tc>
+      </w:tr>
+      <w:tr>
+        <w:trPr>
+          <w:cantSplit/>
+        </w:trPr>
+        <w:tc>
+          <w:tcPr>
+            <w:tcW w:type="dxa" w:w="3254"/>
+            <w:vAlign w:val="center"/>
+            <w:shd w:fill="FBF9F4" w:val="clear"/>
+          </w:tcPr>
+          <w:p>
+            <w:pPr>
+              <w:spacing w:before="40" w:after="40"/>
+              <w:jc w:val="center"/>
+            </w:pPr>
+            <w:r>
+              <w:drawing>
+                <wp:inline xmlns:a="http://schemas.openxmlformats.org/drawingml/2006/main" xmlns:pic="http://schemas.openxmlformats.org/drawingml/2006/picture">
+                  <wp:extent cx="1748238" cy="1691640"/>
+                  <wp:docPr id="14" name="Picture 14" title="10 整理头发" descr="PetForge 示例桌宠动作：整理头发。"/>
+                  <wp:cNvGraphicFramePr>
+                    <a:graphicFrameLocks noChangeAspect="1"/>
+                  </wp:cNvGraphicFramePr>
+                  <a:graphic>
+                    <a:graphicData uri="http://schemas.openxmlformats.org/drawingml/2006/picture">
+                      <pic:pic>
+                        <pic:nvPicPr>
+                          <pic:cNvPr id="0" name="hair-touch.png"/>
+                          <pic:cNvPicPr/>
+                        </pic:nvPicPr>
+                        <pic:blipFill>
+                          <a:blip r:embed="rId23"/>
+                          <a:stretch>
+                            <a:fillRect/>
+                          </a:stretch>
+                        </pic:blipFill>
+                        <pic:spPr>
+                          <a:xfrm>
+                            <a:off x="0" y="0"/>
+                            <a:ext cx="1748238" cy="1691640"/>
+                          </a:xfrm>
+                          <a:prstGeom prst="rect"/>
+                        </pic:spPr>
+                      </pic:pic>
+                    </a:graphicData>
+                  </a:graphic>
+                </wp:inline>
+              </w:drawing>
+            </w:r>
+          </w:p>
+          <w:p>
+            <w:pPr>
+              <w:spacing w:before="20" w:after="80"/>
+              <w:jc w:val="center"/>
+            </w:pPr>
+            <w:r>
+              <w:rPr>
+                <w:b/>
+                <w:color w:val="31594F"/>
+                <w:sz w:val="19"/>
+              </w:rPr>
+              <w:t>10  整理头发</w:t>
+            </w:r>
+          </w:p>
+        </w:tc>
+        <w:tc>
+          <w:tcPr>
+            <w:tcW w:type="dxa" w:w="3254"/>
+            <w:vAlign w:val="center"/>
+            <w:shd w:fill="FBF9F4" w:val="clear"/>
+          </w:tcPr>
+          <w:p>
+            <w:pPr>
+              <w:spacing w:before="40" w:after="40"/>
+              <w:jc w:val="center"/>
+            </w:pPr>
+            <w:r>
+              <w:drawing>
+                <wp:inline xmlns:a="http://schemas.openxmlformats.org/drawingml/2006/main" xmlns:pic="http://schemas.openxmlformats.org/drawingml/2006/picture">
+                  <wp:extent cx="1748238" cy="1691640"/>
+                  <wp:docPr id="15" name="Picture 15" title="11 照镜子" descr="PetForge 示例桌宠动作：照镜子。"/>
+                  <wp:cNvGraphicFramePr>
+                    <a:graphicFrameLocks noChangeAspect="1"/>
+                  </wp:cNvGraphicFramePr>
+                  <a:graphic>
+                    <a:graphicData uri="http://schemas.openxmlformats.org/drawingml/2006/picture">
+                      <pic:pic>
+                        <pic:nvPicPr>
+                          <pic:cNvPr id="0" name="mirror.png"/>
+                          <pic:cNvPicPr/>
+                        </pic:nvPicPr>
+                        <pic:blipFill>
+                          <a:blip r:embed="rId24"/>
+                          <a:stretch>
+                            <a:fillRect/>
+                          </a:stretch>
+                        </pic:blipFill>
+                        <pic:spPr>
+                          <a:xfrm>
+                            <a:off x="0" y="0"/>
+                            <a:ext cx="1748238" cy="1691640"/>
+                          </a:xfrm>
+                          <a:prstGeom prst="rect"/>
+                        </pic:spPr>
+                      </pic:pic>
+                    </a:graphicData>
+                  </a:graphic>
+                </wp:inline>
+              </w:drawing>
+            </w:r>
+          </w:p>
+          <w:p>
+            <w:pPr>
+              <w:spacing w:before="20" w:after="80"/>
+              <w:jc w:val="center"/>
+            </w:pPr>
+            <w:r>
+              <w:rPr>
+                <w:b/>
+                <w:color w:val="31594F"/>
+                <w:sz w:val="19"/>
+              </w:rPr>
+              <w:t>11  照镜子</w:t>
+            </w:r>
+          </w:p>
+        </w:tc>
+        <w:tc>
+          <w:tcPr>
+            <w:tcW w:type="dxa" w:w="3254"/>
+            <w:vAlign w:val="center"/>
+            <w:shd w:fill="FBF9F4" w:val="clear"/>
+          </w:tcPr>
+          <w:p>
+            <w:pPr>
+              <w:spacing w:before="40" w:after="40"/>
+              <w:jc w:val="center"/>
+            </w:pPr>
+            <w:r>
+              <w:drawing>
+                <wp:inline xmlns:a="http://schemas.openxmlformats.org/drawingml/2006/main" xmlns:pic="http://schemas.openxmlformats.org/drawingml/2006/picture">
+                  <wp:extent cx="1748238" cy="1691640"/>
+                  <wp:docPr id="16" name="Picture 16" title="12 托腮思考" descr="PetForge 示例桌宠动作：托腮思考。"/>
+                  <wp:cNvGraphicFramePr>
+                    <a:graphicFrameLocks noChangeAspect="1"/>
+                  </wp:cNvGraphicFramePr>
+                  <a:graphic>
+                    <a:graphicData uri="http://schemas.openxmlformats.org/drawingml/2006/picture">
+                      <pic:pic>
+                        <pic:nvPicPr>
+                          <pic:cNvPr id="0" name="think.png"/>
+                          <pic:cNvPicPr/>
+                        </pic:nvPicPr>
+                        <pic:blipFill>
+                          <a:blip r:embed="rId25"/>
+                          <a:stretch>
+                            <a:fillRect/>
+                          </a:stretch>
+                        </pic:blipFill>
+                        <pic:spPr>
+                          <a:xfrm>
+                            <a:off x="0" y="0"/>
+                            <a:ext cx="1748238" cy="1691640"/>
+                          </a:xfrm>
+                          <a:prstGeom prst="rect"/>
+                        </pic:spPr>
+                      </pic:pic>
+                    </a:graphicData>
+                  </a:graphic>
+                </wp:inline>
+              </w:drawing>
+            </w:r>
+          </w:p>
+          <w:p>
+            <w:pPr>
+              <w:spacing w:before="20" w:after="80"/>
+              <w:jc w:val="center"/>
+            </w:pPr>
+            <w:r>
+              <w:rPr>
+                <w:b/>
+                <w:color w:val="31594F"/>
+                <w:sz w:val="19"/>
+              </w:rPr>
+              <w:t>12  托腮思考</w:t>
+            </w:r>
+          </w:p>
+        </w:tc>
+      </w:tr>
+    </w:tbl>
+    <w:p>
+      <w:r>
+        <w:br w:type="page"/>
+      </w:r>
+    </w:p>
+    <w:p>
+      <w:pPr>
+        <w:pStyle w:val="3"/>
+      </w:pPr>
+      <w:r>
+        <w:t>动作图册三：表情、舒展和手机互动</w:t>
+      </w:r>
+    </w:p>
+    <w:p>
+      <w:pPr>
+        <w:spacing w:after="160"/>
+      </w:pPr>
+      <w:r>
+        <w:t>包括张望、摸脸、轻笑、送心和蹲下玩手机。</w:t>
+      </w:r>
+    </w:p>
+    <w:tbl>
+      <w:tblPr>
+        <w:tblW w:type="auto" w:w="0"/>
+        <w:jc w:val="center"/>
+        <w:tblLayout w:type="fixed"/>
+        <w:tblLook w:firstColumn="1" w:firstRow="1" w:lastColumn="0" w:lastRow="0" w:noHBand="0" w:noVBand="1" w:val="04A0"/>
+        <w:tblBorders>
+          <w:top w:val="single" w:sz="5" w:space="0" w:color="E0DAD2"/>
+          <w:left w:val="single" w:sz="5" w:space="0" w:color="E0DAD2"/>
+          <w:bottom w:val="single" w:sz="5" w:space="0" w:color="E0DAD2"/>
+          <w:right w:val="single" w:sz="5" w:space="0" w:color="E0DAD2"/>
+          <w:insideH w:val="single" w:sz="5" w:space="0" w:color="E0DAD2"/>
+          <w:insideV w:val="single" w:sz="5" w:space="0" w:color="E0DAD2"/>
+        </w:tblBorders>
+      </w:tblPr>
+      <w:tblGrid>
+        <w:gridCol w:w="3254"/>
+        <w:gridCol w:w="3254"/>
+        <w:gridCol w:w="3254"/>
+      </w:tblGrid>
+      <w:tr>
+        <w:trPr>
+          <w:cantSplit/>
+        </w:trPr>
+        <w:tc>
+          <w:tcPr>
+            <w:tcW w:type="dxa" w:w="3254"/>
+            <w:vAlign w:val="center"/>
+            <w:shd w:fill="FBF9F4" w:val="clear"/>
+          </w:tcPr>
+          <w:p>
+            <w:pPr>
+              <w:spacing w:before="40" w:after="40"/>
+              <w:jc w:val="center"/>
+            </w:pPr>
+            <w:r>
+              <w:drawing>
+                <wp:inline xmlns:a="http://schemas.openxmlformats.org/drawingml/2006/main" xmlns:pic="http://schemas.openxmlformats.org/drawingml/2006/picture">
+                  <wp:extent cx="1748238" cy="1691640"/>
+                  <wp:docPr id="17" name="Picture 17" title="13 左右张望" descr="PetForge 示例桌宠动作：左右张望。"/>
+                  <wp:cNvGraphicFramePr>
+                    <a:graphicFrameLocks noChangeAspect="1"/>
+                  </wp:cNvGraphicFramePr>
+                  <a:graphic>
+                    <a:graphicData uri="http://schemas.openxmlformats.org/drawingml/2006/picture">
+                      <pic:pic>
+                        <pic:nvPicPr>
+                          <pic:cNvPr id="0" name="look.png"/>
+                          <pic:cNvPicPr/>
+                        </pic:nvPicPr>
+                        <pic:blipFill>
+                          <a:blip r:embed="rId26"/>
+                          <a:stretch>
+                            <a:fillRect/>
+                          </a:stretch>
+                        </pic:blipFill>
+                        <pic:spPr>
+                          <a:xfrm>
+                            <a:off x="0" y="0"/>
+                            <a:ext cx="1748238" cy="1691640"/>
+                          </a:xfrm>
+                          <a:prstGeom prst="rect"/>
+                        </pic:spPr>
+                      </pic:pic>
+                    </a:graphicData>
+                  </a:graphic>
+                </wp:inline>
+              </w:drawing>
+            </w:r>
+          </w:p>
+          <w:p>
+            <w:pPr>
+              <w:spacing w:before="20" w:after="80"/>
+              <w:jc w:val="center"/>
+            </w:pPr>
+            <w:r>
+              <w:rPr>
+                <w:b/>
+                <w:color w:val="31594F"/>
+                <w:sz w:val="19"/>
+              </w:rPr>
+              <w:t>13  左右张望</w:t>
+            </w:r>
+          </w:p>
+        </w:tc>
+        <w:tc>
+          <w:tcPr>
+            <w:tcW w:type="dxa" w:w="3254"/>
+            <w:vAlign w:val="center"/>
+            <w:shd w:fill="FBF9F4" w:val="clear"/>
+          </w:tcPr>
+          <w:p>
+            <w:pPr>
+              <w:spacing w:before="40" w:after="40"/>
+              <w:jc w:val="center"/>
+            </w:pPr>
+            <w:r>
+              <w:drawing>
+                <wp:inline xmlns:a="http://schemas.openxmlformats.org/drawingml/2006/main" xmlns:pic="http://schemas.openxmlformats.org/drawingml/2006/picture">
+                  <wp:extent cx="1748238" cy="1691640"/>
+                  <wp:docPr id="18" name="Picture 18" title="14 害羞摸脸" descr="PetForge 示例桌宠动作：害羞摸脸。"/>
+                  <wp:cNvGraphicFramePr>
+                    <a:graphicFrameLocks noChangeAspect="1"/>
+                  </wp:cNvGraphicFramePr>
+                  <a:graphic>
+                    <a:graphicData uri="http://schemas.openxmlformats.org/drawingml/2006/picture">
+                      <pic:pic>
+                        <pic:nvPicPr>
+                          <pic:cNvPr id="0" name="shy-face.png"/>
+                          <pic:cNvPicPr/>
+                        </pic:nvPicPr>
+                        <pic:blipFill>
+                          <a:blip r:embed="rId27"/>
+                          <a:stretch>
+                            <a:fillRect/>
+                          </a:stretch>
+                        </pic:blipFill>
+                        <pic:spPr>
+                          <a:xfrm>
+                            <a:off x="0" y="0"/>
+                            <a:ext cx="1748238" cy="1691640"/>
+                          </a:xfrm>
+                          <a:prstGeom prst="rect"/>
+                        </pic:spPr>
+                      </pic:pic>
+                    </a:graphicData>
+                  </a:graphic>
+                </wp:inline>
+              </w:drawing>
+            </w:r>
+          </w:p>
+          <w:p>
+            <w:pPr>
+              <w:spacing w:before="20" w:after="80"/>
+              <w:jc w:val="center"/>
+            </w:pPr>
+            <w:r>
+              <w:rPr>
+                <w:b/>
+                <w:color w:val="31594F"/>
+                <w:sz w:val="19"/>
+              </w:rPr>
+              <w:t>14  害羞摸脸</w:t>
+            </w:r>
+          </w:p>
+        </w:tc>
+        <w:tc>
+          <w:tcPr>
+            <w:tcW w:type="dxa" w:w="3254"/>
+            <w:vAlign w:val="center"/>
+            <w:shd w:fill="FBF9F4" w:val="clear"/>
+          </w:tcPr>
+          <w:p>
+            <w:pPr>
+              <w:spacing w:before="40" w:after="40"/>
+              <w:jc w:val="center"/>
+            </w:pPr>
+            <w:r>
+              <w:drawing>
+                <wp:inline xmlns:a="http://schemas.openxmlformats.org/drawingml/2006/main" xmlns:pic="http://schemas.openxmlformats.org/drawingml/2006/picture">
+                  <wp:extent cx="1748238" cy="1691640"/>
+                  <wp:docPr id="19" name="Picture 19" title="15 抬手舒展" descr="PetForge 示例桌宠动作：抬手舒展。"/>
+                  <wp:cNvGraphicFramePr>
+                    <a:graphicFrameLocks noChangeAspect="1"/>
+                  </wp:cNvGraphicFramePr>
+                  <a:graphic>
+                    <a:graphicData uri="http://schemas.openxmlformats.org/drawingml/2006/picture">
+                      <pic:pic>
+                        <pic:nvPicPr>
+                          <pic:cNvPr id="0" name="stretch.png"/>
+                          <pic:cNvPicPr/>
+                        </pic:nvPicPr>
+                        <pic:blipFill>
+                          <a:blip r:embed="rId28"/>
+                          <a:stretch>
+                            <a:fillRect/>
+                          </a:stretch>
+                        </pic:blipFill>
+                        <pic:spPr>
+                          <a:xfrm>
+                            <a:off x="0" y="0"/>
+                            <a:ext cx="1748238" cy="1691640"/>
+                          </a:xfrm>
+                          <a:prstGeom prst="rect"/>
+                        </pic:spPr>
+                      </pic:pic>
+                    </a:graphicData>
+                  </a:graphic>
+                </wp:inline>
+              </w:drawing>
+            </w:r>
+          </w:p>
+          <w:p>
+            <w:pPr>
+              <w:spacing w:before="20" w:after="80"/>
+              <w:jc w:val="center"/>
+            </w:pPr>
+            <w:r>
+              <w:rPr>
+                <w:b/>
+                <w:color w:val="31594F"/>
+                <w:sz w:val="19"/>
+              </w:rPr>
+              <w:t>15  抬手舒展</w:t>
+            </w:r>
+          </w:p>
+        </w:tc>
+      </w:tr>
+      <w:tr>
+        <w:trPr>
+          <w:cantSplit/>
+        </w:trPr>
+        <w:tc>
+          <w:tcPr>
+            <w:tcW w:type="dxa" w:w="3254"/>
+            <w:vAlign w:val="center"/>
+            <w:shd w:fill="FBF9F4" w:val="clear"/>
+          </w:tcPr>
+          <w:p>
+            <w:pPr>
+              <w:spacing w:before="40" w:after="40"/>
+              <w:jc w:val="center"/>
+            </w:pPr>
+            <w:r>
+              <w:drawing>
+                <wp:inline xmlns:a="http://schemas.openxmlformats.org/drawingml/2006/main" xmlns:pic="http://schemas.openxmlformats.org/drawingml/2006/picture">
+                  <wp:extent cx="1748238" cy="1691640"/>
+                  <wp:docPr id="20" name="Picture 20" title="16 捂嘴轻笑" descr="PetForge 示例桌宠动作：捂嘴轻笑。"/>
+                  <wp:cNvGraphicFramePr>
+                    <a:graphicFrameLocks noChangeAspect="1"/>
+                  </wp:cNvGraphicFramePr>
+                  <a:graphic>
+                    <a:graphicData uri="http://schemas.openxmlformats.org/drawingml/2006/picture">
+                      <pic:pic>
+                        <pic:nvPicPr>
+                          <pic:cNvPr id="0" name="covered-laugh.png"/>
+                          <pic:cNvPicPr/>
+                        </pic:nvPicPr>
+                        <pic:blipFill>
+                          <a:blip r:embed="rId29"/>
+                          <a:stretch>
+                            <a:fillRect/>
+                          </a:stretch>
+                        </pic:blipFill>
+                        <pic:spPr>
+                          <a:xfrm>
+                            <a:off x="0" y="0"/>
+                            <a:ext cx="1748238" cy="1691640"/>
+                          </a:xfrm>
+                          <a:prstGeom prst="rect"/>
+                        </pic:spPr>
+                      </pic:pic>
+                    </a:graphicData>
+                  </a:graphic>
+                </wp:inline>
+              </w:drawing>
+            </w:r>
+          </w:p>
+          <w:p>
+            <w:pPr>
+              <w:spacing w:before="20" w:after="80"/>
+              <w:jc w:val="center"/>
+            </w:pPr>
+            <w:r>
+              <w:rPr>
+                <w:b/>
+                <w:color w:val="31594F"/>
+                <w:sz w:val="19"/>
+              </w:rPr>
+              <w:t>16  捂嘴轻笑</w:t>
+            </w:r>
+          </w:p>
+        </w:tc>
+        <w:tc>
+          <w:tcPr>
+            <w:tcW w:type="dxa" w:w="3254"/>
+            <w:vAlign w:val="center"/>
+            <w:shd w:fill="FBF9F4" w:val="clear"/>
+          </w:tcPr>
+          <w:p>
+            <w:pPr>
+              <w:spacing w:before="40" w:after="40"/>
+              <w:jc w:val="center"/>
+            </w:pPr>
+            <w:r>
+              <w:drawing>
+                <wp:inline xmlns:a="http://schemas.openxmlformats.org/drawingml/2006/main" xmlns:pic="http://schemas.openxmlformats.org/drawingml/2006/picture">
+                  <wp:extent cx="1748238" cy="1691640"/>
+                  <wp:docPr id="21" name="Picture 21" title="17 送出小爱心" descr="PetForge 示例桌宠动作：送出小爱心。"/>
+                  <wp:cNvGraphicFramePr>
+                    <a:graphicFrameLocks noChangeAspect="1"/>
+                  </wp:cNvGraphicFramePr>
+                  <a:graphic>
+                    <a:graphicData uri="http://schemas.openxmlformats.org/drawingml/2006/picture">
+                      <pic:pic>
+                        <pic:nvPicPr>
+                          <pic:cNvPr id="0" name="heart.png"/>
+                          <pic:cNvPicPr/>
+                        </pic:nvPicPr>
+                        <pic:blipFill>
+                          <a:blip r:embed="rId30"/>
+                          <a:stretch>
+                            <a:fillRect/>
+                          </a:stretch>
+                        </pic:blipFill>
+                        <pic:spPr>
+                          <a:xfrm>
+                            <a:off x="0" y="0"/>
+                            <a:ext cx="1748238" cy="1691640"/>
+                          </a:xfrm>
+                          <a:prstGeom prst="rect"/>
+                        </pic:spPr>
+                      </pic:pic>
+                    </a:graphicData>
+                  </a:graphic>
+                </wp:inline>
+              </w:drawing>
+            </w:r>
+          </w:p>
+          <w:p>
+            <w:pPr>
+              <w:spacing w:before="20" w:after="80"/>
+              <w:jc w:val="center"/>
+            </w:pPr>
+            <w:r>
+              <w:rPr>
+                <w:b/>
+                <w:color w:val="31594F"/>
+                <w:sz w:val="19"/>
+              </w:rPr>
+              <w:t>17  送出小爱心</w:t>
+            </w:r>
+          </w:p>
+        </w:tc>
+        <w:tc>
+          <w:tcPr>
+            <w:tcW w:type="dxa" w:w="3254"/>
+            <w:vAlign w:val="center"/>
+            <w:shd w:fill="FBF9F4" w:val="clear"/>
+          </w:tcPr>
+          <w:p>
+            <w:pPr>
+              <w:spacing w:before="40" w:after="40"/>
+              <w:jc w:val="center"/>
+            </w:pPr>
+            <w:r>
+              <w:drawing>
+                <wp:inline xmlns:a="http://schemas.openxmlformats.org/drawingml/2006/main" xmlns:pic="http://schemas.openxmlformats.org/drawingml/2006/picture">
+                  <wp:extent cx="1748238" cy="1691640"/>
+                  <wp:docPr id="22" name="Picture 22" title="18 蹲下玩手机（点按与滑动）" descr="PetForge 示例桌宠动作：蹲下玩手机（点按与滑动）。"/>
+                  <wp:cNvGraphicFramePr>
+                    <a:graphicFrameLocks noChangeAspect="1"/>
+                  </wp:cNvGraphicFramePr>
+                  <a:graphic>
+                    <a:graphicData uri="http://schemas.openxmlformats.org/drawingml/2006/picture">
+                      <pic:pic>
+                        <pic:nvPicPr>
+                          <pic:cNvPr id="0" name="phone.png"/>
+                          <pic:cNvPicPr/>
+                        </pic:nvPicPr>
+                        <pic:blipFill>
+                          <a:blip r:embed="rId31"/>
+                          <a:stretch>
+                            <a:fillRect/>
+                          </a:stretch>
+                        </pic:blipFill>
+                        <pic:spPr>
+                          <a:xfrm>
+                            <a:off x="0" y="0"/>
+                            <a:ext cx="1748238" cy="1691640"/>
+                          </a:xfrm>
+                          <a:prstGeom prst="rect"/>
+                        </pic:spPr>
+                      </pic:pic>
+                    </a:graphicData>
+                  </a:graphic>
+                </wp:inline>
+              </w:drawing>
+            </w:r>
+          </w:p>
+          <w:p>
+            <w:pPr>
+              <w:spacing w:before="20" w:after="80"/>
+              <w:jc w:val="center"/>
+            </w:pPr>
+            <w:r>
+              <w:rPr>
+                <w:b/>
+                <w:color w:val="31594F"/>
+                <w:sz w:val="19"/>
+              </w:rPr>
+              <w:t>18  蹲下玩手机（点按与滑动）</w:t>
+            </w:r>
+          </w:p>
+        </w:tc>
+      </w:tr>
+    </w:tbl>
+    <w:p>
+      <w:r>
+        <w:br w:type="page"/>
+      </w:r>
+    </w:p>
     <w:p>
       <w:pPr>
         <w:spacing w:before="840"/>
@@ -4566,1522 +6082,6 @@
       </w:r>
     </w:p>
     <w:p/>
-    <w:p>
-      <w:r>
-        <w:br w:type="page"/>
-      </w:r>
-    </w:p>
-    <w:p>
-      <w:pPr>
-        <w:pStyle w:val="3"/>
-      </w:pPr>
-      <w:r>
-        <w:t>我的桌宠从照片到角色</w:t>
-      </w:r>
-    </w:p>
-    <w:p>
-      <w:pPr>
-        <w:spacing w:after="160"/>
-      </w:pPr>
-      <w:r>
-        <w:t>我用最初的真人参考照片作为角色设计起点，保留双麻花辫、碎花上衣、浅色衣裙和棕色鞋子等外观特点，再把角色整理成适合桌面显示的完整立绘。</w:t>
-      </w:r>
-    </w:p>
-    <w:p>
-      <w:pPr>
-        <w:spacing w:after="200"/>
-      </w:pPr>
-      <w:r>
-        <w:t>这是一套由作者反复设计和微调的个人作品。照片对照用于展示这次创作结果，不代表任意用户上传照片后都能自动得到同等完成度。当前普通照片路线以本机抠图和轻量滤镜为主。</w:t>
-      </w:r>
-    </w:p>
-    <w:tbl>
-      <w:tblPr>
-        <w:tblW w:type="auto" w:w="0"/>
-        <w:jc w:val="center"/>
-        <w:tblLayout w:type="fixed"/>
-        <w:tblLook w:firstColumn="1" w:firstRow="1" w:lastColumn="0" w:lastRow="0" w:noHBand="0" w:noVBand="1" w:val="04A0"/>
-        <w:tblBorders>
-          <w:top w:val="single" w:sz="5" w:space="0" w:color="D9E2DC"/>
-          <w:left w:val="single" w:sz="5" w:space="0" w:color="D9E2DC"/>
-          <w:bottom w:val="single" w:sz="5" w:space="0" w:color="D9E2DC"/>
-          <w:right w:val="single" w:sz="5" w:space="0" w:color="D9E2DC"/>
-          <w:insideH w:val="single" w:sz="5" w:space="0" w:color="D9E2DC"/>
-          <w:insideV w:val="single" w:sz="5" w:space="0" w:color="D9E2DC"/>
-        </w:tblBorders>
-      </w:tblPr>
-      <w:tblGrid>
-        <w:gridCol w:w="4795"/>
-        <w:gridCol w:w="4795"/>
-      </w:tblGrid>
-      <w:tr>
-        <w:trPr>
-          <w:cantSplit/>
-        </w:trPr>
-        <w:tc>
-          <w:tcPr>
-            <w:tcW w:type="dxa" w:w="4795"/>
-            <w:vAlign w:val="center"/>
-            <w:shd w:fill="F7F8F4" w:val="clear"/>
-          </w:tcPr>
-          <w:p>
-            <w:pPr>
-              <w:spacing w:before="100" w:after="100"/>
-              <w:jc w:val="center"/>
-            </w:pPr>
-            <w:r>
-              <w:rPr>
-                <w:b/>
-                <w:color w:val="2B675B"/>
-                <w:sz w:val="22"/>
-              </w:rPr>
-              <w:t>原始真人参考照片</w:t>
-            </w:r>
-          </w:p>
-        </w:tc>
-        <w:tc>
-          <w:tcPr>
-            <w:tcW w:type="dxa" w:w="4795"/>
-            <w:vAlign w:val="center"/>
-            <w:shd w:fill="F7F8F4" w:val="clear"/>
-          </w:tcPr>
-          <w:p>
-            <w:pPr>
-              <w:spacing w:before="100" w:after="100"/>
-              <w:jc w:val="center"/>
-            </w:pPr>
-            <w:r>
-              <w:rPr>
-                <w:b/>
-                <w:color w:val="2B675B"/>
-                <w:sz w:val="22"/>
-              </w:rPr>
-              <w:t>PetForge 卡通桌宠</w:t>
-            </w:r>
-          </w:p>
-        </w:tc>
-      </w:tr>
-      <w:tr>
-        <w:trPr>
-          <w:cantSplit/>
-        </w:trPr>
-        <w:tc>
-          <w:tcPr>
-            <w:tcW w:type="dxa" w:w="4795"/>
-            <w:vAlign w:val="center"/>
-            <w:shd w:fill="F7F8F4" w:val="clear"/>
-          </w:tcPr>
-          <w:p>
-            <w:pPr>
-              <w:spacing w:before="40" w:after="40"/>
-              <w:jc w:val="center"/>
-            </w:pPr>
-            <w:r>
-              <w:drawing>
-                <wp:inline xmlns:a="http://schemas.openxmlformats.org/drawingml/2006/main" xmlns:pic="http://schemas.openxmlformats.org/drawingml/2006/picture">
-                  <wp:extent cx="2500563" cy="3337560"/>
-                  <wp:docPr id="3" name="Picture 3" title="作者授权展示的真人参考照片" descr="照片中的人物梳双麻花辫，穿碎花上衣和浅色衣裙，站在花墙前。"/>
-                  <wp:cNvGraphicFramePr>
-                    <a:graphicFrameLocks noChangeAspect="1"/>
-                  </wp:cNvGraphicFramePr>
-                  <a:graphic>
-                    <a:graphicData uri="http://schemas.openxmlformats.org/drawingml/2006/picture">
-                      <pic:pic>
-                        <pic:nvPicPr>
-                          <pic:cNvPr id="0" name="reference-photo.jpg"/>
-                          <pic:cNvPicPr/>
-                        </pic:nvPicPr>
-                        <pic:blipFill>
-                          <a:blip r:embed="rId13"/>
-                          <a:stretch>
-                            <a:fillRect/>
-                          </a:stretch>
-                        </pic:blipFill>
-                        <pic:spPr>
-                          <a:xfrm>
-                            <a:off x="0" y="0"/>
-                            <a:ext cx="2500563" cy="3337560"/>
-                          </a:xfrm>
-                          <a:prstGeom prst="rect"/>
-                        </pic:spPr>
-                      </pic:pic>
-                    </a:graphicData>
-                  </a:graphic>
-                </wp:inline>
-              </w:drawing>
-            </w:r>
-          </w:p>
-        </w:tc>
-        <w:tc>
-          <w:tcPr>
-            <w:tcW w:type="dxa" w:w="4795"/>
-            <w:vAlign w:val="center"/>
-            <w:shd w:fill="F7F8F4" w:val="clear"/>
-          </w:tcPr>
-          <w:p>
-            <w:pPr>
-              <w:spacing w:before="40" w:after="40"/>
-              <w:jc w:val="center"/>
-            </w:pPr>
-            <w:r>
-              <w:drawing>
-                <wp:inline xmlns:a="http://schemas.openxmlformats.org/drawingml/2006/main" xmlns:pic="http://schemas.openxmlformats.org/drawingml/2006/picture">
-                  <wp:extent cx="1780032" cy="3337560"/>
-                  <wp:docPr id="4" name="Picture 4" title="根据参考照片设计的桌宠角色" descr="全身卡通女孩桌宠，保留双麻花辫、碎花上衣、浅色衣裙和棕色鞋子。"/>
-                  <wp:cNvGraphicFramePr>
-                    <a:graphicFrameLocks noChangeAspect="1"/>
-                  </wp:cNvGraphicFramePr>
-                  <a:graphic>
-                    <a:graphicData uri="http://schemas.openxmlformats.org/drawingml/2006/picture">
-                      <pic:pic>
-                        <pic:nvPicPr>
-                          <pic:cNvPr id="0" name="idle-portrait.png"/>
-                          <pic:cNvPicPr/>
-                        </pic:nvPicPr>
-                        <pic:blipFill>
-                          <a:blip r:embed="rId14"/>
-                          <a:stretch>
-                            <a:fillRect/>
-                          </a:stretch>
-                        </pic:blipFill>
-                        <pic:spPr>
-                          <a:xfrm>
-                            <a:off x="0" y="0"/>
-                            <a:ext cx="1780032" cy="3337560"/>
-                          </a:xfrm>
-                          <a:prstGeom prst="rect"/>
-                        </pic:spPr>
-                      </pic:pic>
-                    </a:graphicData>
-                  </a:graphic>
-                </wp:inline>
-              </w:drawing>
-            </w:r>
-          </w:p>
-        </w:tc>
-      </w:tr>
-      <w:tr>
-        <w:trPr>
-          <w:cantSplit/>
-        </w:trPr>
-        <w:tc>
-          <w:tcPr>
-            <w:tcW w:type="dxa" w:w="4795"/>
-            <w:vAlign w:val="center"/>
-            <w:shd w:fill="F7F8F4" w:val="clear"/>
-          </w:tcPr>
-          <w:p/>
-          <w:p>
-            <w:pPr>
-              <w:spacing w:before="20" w:after="80"/>
-              <w:jc w:val="center"/>
-            </w:pPr>
-            <w:r>
-              <w:rPr>
-                <w:b/>
-                <w:color w:val="31594F"/>
-                <w:sz w:val="21"/>
-              </w:rPr>
-              <w:t>用于观察发型、服装和整体气质</w:t>
-            </w:r>
-          </w:p>
-        </w:tc>
-        <w:tc>
-          <w:tcPr>
-            <w:tcW w:type="dxa" w:w="4795"/>
-            <w:vAlign w:val="center"/>
-            <w:shd w:fill="F7F8F4" w:val="clear"/>
-          </w:tcPr>
-          <w:p/>
-          <w:p>
-            <w:pPr>
-              <w:spacing w:before="20" w:after="80"/>
-              <w:jc w:val="center"/>
-            </w:pPr>
-            <w:r>
-              <w:rPr>
-                <w:b/>
-                <w:color w:val="31594F"/>
-                <w:sz w:val="21"/>
-              </w:rPr>
-              <w:t>人工设计后继续调整外观与动作</w:t>
-            </w:r>
-          </w:p>
-        </w:tc>
-      </w:tr>
-    </w:tbl>
-    <w:p>
-      <w:pPr>
-        <w:pStyle w:val="15"/>
-        <w:spacing w:before="160"/>
-        <w:jc w:val="center"/>
-      </w:pPr>
-      <w:r>
-        <w:t>图 3  作者授权展示的参考照片与完成后的桌宠立绘。其他用户的照片和生成中间稿仍留在本机，不会自动进入公开示例。</w:t>
-      </w:r>
-    </w:p>
-    <w:p>
-      <w:r>
-        <w:br w:type="page"/>
-      </w:r>
-    </w:p>
-    <w:p>
-      <w:pPr>
-        <w:pStyle w:val="3"/>
-      </w:pPr>
-      <w:r>
-        <w:t>动作图册一：日常状态与移动</w:t>
-      </w:r>
-    </w:p>
-    <w:p>
-      <w:pPr>
-        <w:spacing w:after="160"/>
-      </w:pPr>
-      <w:r>
-        <w:t>包括待机、等待、眨眼、睡觉和左右跑动。</w:t>
-      </w:r>
-    </w:p>
-    <w:p>
-      <w:pPr>
-        <w:spacing w:after="200"/>
-      </w:pPr>
-      <w:r>
-        <w:t>下面展示的是我为这套示例角色制作和调整的 18 张动作图。每项动作都能单独预览和修改；新上传的照片不会自动继承这些专属动作。</w:t>
-      </w:r>
-    </w:p>
-    <w:tbl>
-      <w:tblPr>
-        <w:tblW w:type="auto" w:w="0"/>
-        <w:jc w:val="center"/>
-        <w:tblLayout w:type="fixed"/>
-        <w:tblLook w:firstColumn="1" w:firstRow="1" w:lastColumn="0" w:lastRow="0" w:noHBand="0" w:noVBand="1" w:val="04A0"/>
-        <w:tblBorders>
-          <w:top w:val="single" w:sz="5" w:space="0" w:color="E0DAD2"/>
-          <w:left w:val="single" w:sz="5" w:space="0" w:color="E0DAD2"/>
-          <w:bottom w:val="single" w:sz="5" w:space="0" w:color="E0DAD2"/>
-          <w:right w:val="single" w:sz="5" w:space="0" w:color="E0DAD2"/>
-          <w:insideH w:val="single" w:sz="5" w:space="0" w:color="E0DAD2"/>
-          <w:insideV w:val="single" w:sz="5" w:space="0" w:color="E0DAD2"/>
-        </w:tblBorders>
-      </w:tblPr>
-      <w:tblGrid>
-        <w:gridCol w:w="3254"/>
-        <w:gridCol w:w="3254"/>
-        <w:gridCol w:w="3254"/>
-      </w:tblGrid>
-      <w:tr>
-        <w:trPr>
-          <w:cantSplit/>
-        </w:trPr>
-        <w:tc>
-          <w:tcPr>
-            <w:tcW w:type="dxa" w:w="3254"/>
-            <w:vAlign w:val="center"/>
-            <w:shd w:fill="FBF9F4" w:val="clear"/>
-          </w:tcPr>
-          <w:p>
-            <w:pPr>
-              <w:spacing w:before="40" w:after="40"/>
-              <w:jc w:val="center"/>
-            </w:pPr>
-            <w:r>
-              <w:drawing>
-                <wp:inline xmlns:a="http://schemas.openxmlformats.org/drawingml/2006/main" xmlns:pic="http://schemas.openxmlformats.org/drawingml/2006/picture">
-                  <wp:extent cx="902208" cy="1691640"/>
-                  <wp:docPr id="5" name="Picture 5" title="01 安静待机" descr="PetForge 示例桌宠动作：安静待机。"/>
-                  <wp:cNvGraphicFramePr>
-                    <a:graphicFrameLocks noChangeAspect="1"/>
-                  </wp:cNvGraphicFramePr>
-                  <a:graphic>
-                    <a:graphicData uri="http://schemas.openxmlformats.org/drawingml/2006/picture">
-                      <pic:pic>
-                        <pic:nvPicPr>
-                          <pic:cNvPr id="0" name="idle-portrait.png"/>
-                          <pic:cNvPicPr/>
-                        </pic:nvPicPr>
-                        <pic:blipFill>
-                          <a:blip r:embed="rId14"/>
-                          <a:stretch>
-                            <a:fillRect/>
-                          </a:stretch>
-                        </pic:blipFill>
-                        <pic:spPr>
-                          <a:xfrm>
-                            <a:off x="0" y="0"/>
-                            <a:ext cx="902208" cy="1691640"/>
-                          </a:xfrm>
-                          <a:prstGeom prst="rect"/>
-                        </pic:spPr>
-                      </pic:pic>
-                    </a:graphicData>
-                  </a:graphic>
-                </wp:inline>
-              </w:drawing>
-            </w:r>
-          </w:p>
-          <w:p>
-            <w:pPr>
-              <w:spacing w:before="20" w:after="80"/>
-              <w:jc w:val="center"/>
-            </w:pPr>
-            <w:r>
-              <w:rPr>
-                <w:b/>
-                <w:color w:val="31594F"/>
-                <w:sz w:val="19"/>
-              </w:rPr>
-              <w:t>01  安静待机</w:t>
-            </w:r>
-          </w:p>
-        </w:tc>
-        <w:tc>
-          <w:tcPr>
-            <w:tcW w:type="dxa" w:w="3254"/>
-            <w:vAlign w:val="center"/>
-            <w:shd w:fill="FBF9F4" w:val="clear"/>
-          </w:tcPr>
-          <w:p>
-            <w:pPr>
-              <w:spacing w:before="40" w:after="40"/>
-              <w:jc w:val="center"/>
-            </w:pPr>
-            <w:r>
-              <w:drawing>
-                <wp:inline xmlns:a="http://schemas.openxmlformats.org/drawingml/2006/main" xmlns:pic="http://schemas.openxmlformats.org/drawingml/2006/picture">
-                  <wp:extent cx="1748238" cy="1691640"/>
-                  <wp:docPr id="6" name="Picture 6" title="02 等待输入" descr="PetForge 示例桌宠动作：等待输入。"/>
-                  <wp:cNvGraphicFramePr>
-                    <a:graphicFrameLocks noChangeAspect="1"/>
-                  </wp:cNvGraphicFramePr>
-                  <a:graphic>
-                    <a:graphicData uri="http://schemas.openxmlformats.org/drawingml/2006/picture">
-                      <pic:pic>
-                        <pic:nvPicPr>
-                          <pic:cNvPr id="0" name="waiting.png"/>
-                          <pic:cNvPicPr/>
-                        </pic:nvPicPr>
-                        <pic:blipFill>
-                          <a:blip r:embed="rId15"/>
-                          <a:stretch>
-                            <a:fillRect/>
-                          </a:stretch>
-                        </pic:blipFill>
-                        <pic:spPr>
-                          <a:xfrm>
-                            <a:off x="0" y="0"/>
-                            <a:ext cx="1748238" cy="1691640"/>
-                          </a:xfrm>
-                          <a:prstGeom prst="rect"/>
-                        </pic:spPr>
-                      </pic:pic>
-                    </a:graphicData>
-                  </a:graphic>
-                </wp:inline>
-              </w:drawing>
-            </w:r>
-          </w:p>
-          <w:p>
-            <w:pPr>
-              <w:spacing w:before="20" w:after="80"/>
-              <w:jc w:val="center"/>
-            </w:pPr>
-            <w:r>
-              <w:rPr>
-                <w:b/>
-                <w:color w:val="31594F"/>
-                <w:sz w:val="19"/>
-              </w:rPr>
-              <w:t>02  等待输入</w:t>
-            </w:r>
-          </w:p>
-        </w:tc>
-        <w:tc>
-          <w:tcPr>
-            <w:tcW w:type="dxa" w:w="3254"/>
-            <w:vAlign w:val="center"/>
-            <w:shd w:fill="FBF9F4" w:val="clear"/>
-          </w:tcPr>
-          <w:p>
-            <w:pPr>
-              <w:spacing w:before="40" w:after="40"/>
-              <w:jc w:val="center"/>
-            </w:pPr>
-            <w:r>
-              <w:drawing>
-                <wp:inline xmlns:a="http://schemas.openxmlformats.org/drawingml/2006/main" xmlns:pic="http://schemas.openxmlformats.org/drawingml/2006/picture">
-                  <wp:extent cx="902208" cy="1691640"/>
-                  <wp:docPr id="7" name="Picture 7" title="03 眨眼微笑" descr="PetForge 示例桌宠动作：眨眼微笑。"/>
-                  <wp:cNvGraphicFramePr>
-                    <a:graphicFrameLocks noChangeAspect="1"/>
-                  </wp:cNvGraphicFramePr>
-                  <a:graphic>
-                    <a:graphicData uri="http://schemas.openxmlformats.org/drawingml/2006/picture">
-                      <pic:pic>
-                        <pic:nvPicPr>
-                          <pic:cNvPr id="0" name="blink.png"/>
-                          <pic:cNvPicPr/>
-                        </pic:nvPicPr>
-                        <pic:blipFill>
-                          <a:blip r:embed="rId16"/>
-                          <a:stretch>
-                            <a:fillRect/>
-                          </a:stretch>
-                        </pic:blipFill>
-                        <pic:spPr>
-                          <a:xfrm>
-                            <a:off x="0" y="0"/>
-                            <a:ext cx="902208" cy="1691640"/>
-                          </a:xfrm>
-                          <a:prstGeom prst="rect"/>
-                        </pic:spPr>
-                      </pic:pic>
-                    </a:graphicData>
-                  </a:graphic>
-                </wp:inline>
-              </w:drawing>
-            </w:r>
-          </w:p>
-          <w:p>
-            <w:pPr>
-              <w:spacing w:before="20" w:after="80"/>
-              <w:jc w:val="center"/>
-            </w:pPr>
-            <w:r>
-              <w:rPr>
-                <w:b/>
-                <w:color w:val="31594F"/>
-                <w:sz w:val="19"/>
-              </w:rPr>
-              <w:t>03  眨眼微笑</w:t>
-            </w:r>
-          </w:p>
-        </w:tc>
-      </w:tr>
-      <w:tr>
-        <w:trPr>
-          <w:cantSplit/>
-        </w:trPr>
-        <w:tc>
-          <w:tcPr>
-            <w:tcW w:type="dxa" w:w="3254"/>
-            <w:vAlign w:val="center"/>
-            <w:shd w:fill="FBF9F4" w:val="clear"/>
-          </w:tcPr>
-          <w:p>
-            <w:pPr>
-              <w:spacing w:before="40" w:after="40"/>
-              <w:jc w:val="center"/>
-            </w:pPr>
-            <w:r>
-              <w:drawing>
-                <wp:inline xmlns:a="http://schemas.openxmlformats.org/drawingml/2006/main" xmlns:pic="http://schemas.openxmlformats.org/drawingml/2006/picture">
-                  <wp:extent cx="1748238" cy="1691640"/>
-                  <wp:docPr id="8" name="Picture 8" title="04 睡觉" descr="PetForge 示例桌宠动作：睡觉。"/>
-                  <wp:cNvGraphicFramePr>
-                    <a:graphicFrameLocks noChangeAspect="1"/>
-                  </wp:cNvGraphicFramePr>
-                  <a:graphic>
-                    <a:graphicData uri="http://schemas.openxmlformats.org/drawingml/2006/picture">
-                      <pic:pic>
-                        <pic:nvPicPr>
-                          <pic:cNvPr id="0" name="sleep.png"/>
-                          <pic:cNvPicPr/>
-                        </pic:nvPicPr>
-                        <pic:blipFill>
-                          <a:blip r:embed="rId17"/>
-                          <a:stretch>
-                            <a:fillRect/>
-                          </a:stretch>
-                        </pic:blipFill>
-                        <pic:spPr>
-                          <a:xfrm>
-                            <a:off x="0" y="0"/>
-                            <a:ext cx="1748238" cy="1691640"/>
-                          </a:xfrm>
-                          <a:prstGeom prst="rect"/>
-                        </pic:spPr>
-                      </pic:pic>
-                    </a:graphicData>
-                  </a:graphic>
-                </wp:inline>
-              </w:drawing>
-            </w:r>
-          </w:p>
-          <w:p>
-            <w:pPr>
-              <w:spacing w:before="20" w:after="80"/>
-              <w:jc w:val="center"/>
-            </w:pPr>
-            <w:r>
-              <w:rPr>
-                <w:b/>
-                <w:color w:val="31594F"/>
-                <w:sz w:val="19"/>
-              </w:rPr>
-              <w:t>04  睡觉</w:t>
-            </w:r>
-          </w:p>
-        </w:tc>
-        <w:tc>
-          <w:tcPr>
-            <w:tcW w:type="dxa" w:w="3254"/>
-            <w:vAlign w:val="center"/>
-            <w:shd w:fill="FBF9F4" w:val="clear"/>
-          </w:tcPr>
-          <w:p>
-            <w:pPr>
-              <w:spacing w:before="40" w:after="40"/>
-              <w:jc w:val="center"/>
-            </w:pPr>
-            <w:r>
-              <w:drawing>
-                <wp:inline xmlns:a="http://schemas.openxmlformats.org/drawingml/2006/main" xmlns:pic="http://schemas.openxmlformats.org/drawingml/2006/picture">
-                  <wp:extent cx="1774835" cy="1691640"/>
-                  <wp:docPr id="9" name="Picture 9" title="05 向左跑" descr="PetForge 示例桌宠动作：向左跑。"/>
-                  <wp:cNvGraphicFramePr>
-                    <a:graphicFrameLocks noChangeAspect="1"/>
-                  </wp:cNvGraphicFramePr>
-                  <a:graphic>
-                    <a:graphicData uri="http://schemas.openxmlformats.org/drawingml/2006/picture">
-                      <pic:pic>
-                        <pic:nvPicPr>
-                          <pic:cNvPr id="0" name="run-left.png"/>
-                          <pic:cNvPicPr/>
-                        </pic:nvPicPr>
-                        <pic:blipFill>
-                          <a:blip r:embed="rId18"/>
-                          <a:stretch>
-                            <a:fillRect/>
-                          </a:stretch>
-                        </pic:blipFill>
-                        <pic:spPr>
-                          <a:xfrm>
-                            <a:off x="0" y="0"/>
-                            <a:ext cx="1774835" cy="1691640"/>
-                          </a:xfrm>
-                          <a:prstGeom prst="rect"/>
-                        </pic:spPr>
-                      </pic:pic>
-                    </a:graphicData>
-                  </a:graphic>
-                </wp:inline>
-              </w:drawing>
-            </w:r>
-          </w:p>
-          <w:p>
-            <w:pPr>
-              <w:spacing w:before="20" w:after="80"/>
-              <w:jc w:val="center"/>
-            </w:pPr>
-            <w:r>
-              <w:rPr>
-                <w:b/>
-                <w:color w:val="31594F"/>
-                <w:sz w:val="19"/>
-              </w:rPr>
-              <w:t>05  向左跑</w:t>
-            </w:r>
-          </w:p>
-        </w:tc>
-        <w:tc>
-          <w:tcPr>
-            <w:tcW w:type="dxa" w:w="3254"/>
-            <w:vAlign w:val="center"/>
-            <w:shd w:fill="FBF9F4" w:val="clear"/>
-          </w:tcPr>
-          <w:p>
-            <w:pPr>
-              <w:spacing w:before="40" w:after="40"/>
-              <w:jc w:val="center"/>
-            </w:pPr>
-            <w:r>
-              <w:drawing>
-                <wp:inline xmlns:a="http://schemas.openxmlformats.org/drawingml/2006/main" xmlns:pic="http://schemas.openxmlformats.org/drawingml/2006/picture">
-                  <wp:extent cx="1774835" cy="1691640"/>
-                  <wp:docPr id="10" name="Picture 10" title="06 向右跑" descr="PetForge 示例桌宠动作：向右跑。"/>
-                  <wp:cNvGraphicFramePr>
-                    <a:graphicFrameLocks noChangeAspect="1"/>
-                  </wp:cNvGraphicFramePr>
-                  <a:graphic>
-                    <a:graphicData uri="http://schemas.openxmlformats.org/drawingml/2006/picture">
-                      <pic:pic>
-                        <pic:nvPicPr>
-                          <pic:cNvPr id="0" name="run-right.png"/>
-                          <pic:cNvPicPr/>
-                        </pic:nvPicPr>
-                        <pic:blipFill>
-                          <a:blip r:embed="rId19"/>
-                          <a:stretch>
-                            <a:fillRect/>
-                          </a:stretch>
-                        </pic:blipFill>
-                        <pic:spPr>
-                          <a:xfrm>
-                            <a:off x="0" y="0"/>
-                            <a:ext cx="1774835" cy="1691640"/>
-                          </a:xfrm>
-                          <a:prstGeom prst="rect"/>
-                        </pic:spPr>
-                      </pic:pic>
-                    </a:graphicData>
-                  </a:graphic>
-                </wp:inline>
-              </w:drawing>
-            </w:r>
-          </w:p>
-          <w:p>
-            <w:pPr>
-              <w:spacing w:before="20" w:after="80"/>
-              <w:jc w:val="center"/>
-            </w:pPr>
-            <w:r>
-              <w:rPr>
-                <w:b/>
-                <w:color w:val="31594F"/>
-                <w:sz w:val="19"/>
-              </w:rPr>
-              <w:t>06  向右跑</w:t>
-            </w:r>
-          </w:p>
-        </w:tc>
-      </w:tr>
-    </w:tbl>
-    <w:p>
-      <w:r>
-        <w:br w:type="page"/>
-      </w:r>
-    </w:p>
-    <w:p>
-      <w:pPr>
-        <w:pStyle w:val="3"/>
-      </w:pPr>
-      <w:r>
-        <w:t>动作图册二：问候和日常小动作</w:t>
-      </w:r>
-    </w:p>
-    <w:p>
-      <w:pPr>
-        <w:spacing w:after="160"/>
-      </w:pPr>
-      <w:r>
-        <w:t>包括招手微笑、整理头发、照镜子和思考等动作。</w:t>
-      </w:r>
-    </w:p>
-    <w:tbl>
-      <w:tblPr>
-        <w:tblW w:type="auto" w:w="0"/>
-        <w:jc w:val="center"/>
-        <w:tblLayout w:type="fixed"/>
-        <w:tblLook w:firstColumn="1" w:firstRow="1" w:lastColumn="0" w:lastRow="0" w:noHBand="0" w:noVBand="1" w:val="04A0"/>
-        <w:tblBorders>
-          <w:top w:val="single" w:sz="5" w:space="0" w:color="E0DAD2"/>
-          <w:left w:val="single" w:sz="5" w:space="0" w:color="E0DAD2"/>
-          <w:bottom w:val="single" w:sz="5" w:space="0" w:color="E0DAD2"/>
-          <w:right w:val="single" w:sz="5" w:space="0" w:color="E0DAD2"/>
-          <w:insideH w:val="single" w:sz="5" w:space="0" w:color="E0DAD2"/>
-          <w:insideV w:val="single" w:sz="5" w:space="0" w:color="E0DAD2"/>
-        </w:tblBorders>
-      </w:tblPr>
-      <w:tblGrid>
-        <w:gridCol w:w="3254"/>
-        <w:gridCol w:w="3254"/>
-        <w:gridCol w:w="3254"/>
-      </w:tblGrid>
-      <w:tr>
-        <w:trPr>
-          <w:cantSplit/>
-        </w:trPr>
-        <w:tc>
-          <w:tcPr>
-            <w:tcW w:type="dxa" w:w="3254"/>
-            <w:vAlign w:val="center"/>
-            <w:shd w:fill="FBF9F4" w:val="clear"/>
-          </w:tcPr>
-          <w:p>
-            <w:pPr>
-              <w:spacing w:before="40" w:after="40"/>
-              <w:jc w:val="center"/>
-            </w:pPr>
-            <w:r>
-              <w:drawing>
-                <wp:inline xmlns:a="http://schemas.openxmlformats.org/drawingml/2006/main" xmlns:pic="http://schemas.openxmlformats.org/drawingml/2006/picture">
-                  <wp:extent cx="1748238" cy="1691640"/>
-                  <wp:docPr id="11" name="Picture 11" title="07 招手微笑（手边小爱心）" descr="PetForge 示例桌宠动作：招手微笑（手边小爱心）。"/>
-                  <wp:cNvGraphicFramePr>
-                    <a:graphicFrameLocks noChangeAspect="1"/>
-                  </wp:cNvGraphicFramePr>
-                  <a:graphic>
-                    <a:graphicData uri="http://schemas.openxmlformats.org/drawingml/2006/picture">
-                      <pic:pic>
-                        <pic:nvPicPr>
-                          <pic:cNvPr id="0" name="wave-heart.png"/>
-                          <pic:cNvPicPr/>
-                        </pic:nvPicPr>
-                        <pic:blipFill>
-                          <a:blip r:embed="rId20"/>
-                          <a:stretch>
-                            <a:fillRect/>
-                          </a:stretch>
-                        </pic:blipFill>
-                        <pic:spPr>
-                          <a:xfrm>
-                            <a:off x="0" y="0"/>
-                            <a:ext cx="1748238" cy="1691640"/>
-                          </a:xfrm>
-                          <a:prstGeom prst="rect"/>
-                        </pic:spPr>
-                      </pic:pic>
-                    </a:graphicData>
-                  </a:graphic>
-                </wp:inline>
-              </w:drawing>
-            </w:r>
-          </w:p>
-          <w:p>
-            <w:pPr>
-              <w:spacing w:before="20" w:after="80"/>
-              <w:jc w:val="center"/>
-            </w:pPr>
-            <w:r>
-              <w:rPr>
-                <w:b/>
-                <w:color w:val="31594F"/>
-                <w:sz w:val="19"/>
-              </w:rPr>
-              <w:t>07  招手微笑（手边小爱心）</w:t>
-            </w:r>
-          </w:p>
-        </w:tc>
-        <w:tc>
-          <w:tcPr>
-            <w:tcW w:type="dxa" w:w="3254"/>
-            <w:vAlign w:val="center"/>
-            <w:shd w:fill="FBF9F4" w:val="clear"/>
-          </w:tcPr>
-          <w:p>
-            <w:pPr>
-              <w:spacing w:before="40" w:after="40"/>
-              <w:jc w:val="center"/>
-            </w:pPr>
-            <w:r>
-              <w:drawing>
-                <wp:inline xmlns:a="http://schemas.openxmlformats.org/drawingml/2006/main" xmlns:pic="http://schemas.openxmlformats.org/drawingml/2006/picture">
-                  <wp:extent cx="1748238" cy="1691640"/>
-                  <wp:docPr id="12" name="Picture 12" title="08 开心微笑" descr="PetForge 示例桌宠动作：开心微笑。"/>
-                  <wp:cNvGraphicFramePr>
-                    <a:graphicFrameLocks noChangeAspect="1"/>
-                  </wp:cNvGraphicFramePr>
-                  <a:graphic>
-                    <a:graphicData uri="http://schemas.openxmlformats.org/drawingml/2006/picture">
-                      <pic:pic>
-                        <pic:nvPicPr>
-                          <pic:cNvPr id="0" name="happy.png"/>
-                          <pic:cNvPicPr/>
-                        </pic:nvPicPr>
-                        <pic:blipFill>
-                          <a:blip r:embed="rId21"/>
-                          <a:stretch>
-                            <a:fillRect/>
-                          </a:stretch>
-                        </pic:blipFill>
-                        <pic:spPr>
-                          <a:xfrm>
-                            <a:off x="0" y="0"/>
-                            <a:ext cx="1748238" cy="1691640"/>
-                          </a:xfrm>
-                          <a:prstGeom prst="rect"/>
-                        </pic:spPr>
-                      </pic:pic>
-                    </a:graphicData>
-                  </a:graphic>
-                </wp:inline>
-              </w:drawing>
-            </w:r>
-          </w:p>
-          <w:p>
-            <w:pPr>
-              <w:spacing w:before="20" w:after="80"/>
-              <w:jc w:val="center"/>
-            </w:pPr>
-            <w:r>
-              <w:rPr>
-                <w:b/>
-                <w:color w:val="31594F"/>
-                <w:sz w:val="19"/>
-              </w:rPr>
-              <w:t>08  开心微笑</w:t>
-            </w:r>
-          </w:p>
-        </w:tc>
-        <w:tc>
-          <w:tcPr>
-            <w:tcW w:type="dxa" w:w="3254"/>
-            <w:vAlign w:val="center"/>
-            <w:shd w:fill="FBF9F4" w:val="clear"/>
-          </w:tcPr>
-          <w:p>
-            <w:pPr>
-              <w:spacing w:before="40" w:after="40"/>
-              <w:jc w:val="center"/>
-            </w:pPr>
-            <w:r>
-              <w:drawing>
-                <wp:inline xmlns:a="http://schemas.openxmlformats.org/drawingml/2006/main" xmlns:pic="http://schemas.openxmlformats.org/drawingml/2006/picture">
-                  <wp:extent cx="1748238" cy="1691640"/>
-                  <wp:docPr id="13" name="Picture 13" title="09 点头致意" descr="PetForge 示例桌宠动作：点头致意。"/>
-                  <wp:cNvGraphicFramePr>
-                    <a:graphicFrameLocks noChangeAspect="1"/>
-                  </wp:cNvGraphicFramePr>
-                  <a:graphic>
-                    <a:graphicData uri="http://schemas.openxmlformats.org/drawingml/2006/picture">
-                      <pic:pic>
-                        <pic:nvPicPr>
-                          <pic:cNvPr id="0" name="bow.png"/>
-                          <pic:cNvPicPr/>
-                        </pic:nvPicPr>
-                        <pic:blipFill>
-                          <a:blip r:embed="rId22"/>
-                          <a:stretch>
-                            <a:fillRect/>
-                          </a:stretch>
-                        </pic:blipFill>
-                        <pic:spPr>
-                          <a:xfrm>
-                            <a:off x="0" y="0"/>
-                            <a:ext cx="1748238" cy="1691640"/>
-                          </a:xfrm>
-                          <a:prstGeom prst="rect"/>
-                        </pic:spPr>
-                      </pic:pic>
-                    </a:graphicData>
-                  </a:graphic>
-                </wp:inline>
-              </w:drawing>
-            </w:r>
-          </w:p>
-          <w:p>
-            <w:pPr>
-              <w:spacing w:before="20" w:after="80"/>
-              <w:jc w:val="center"/>
-            </w:pPr>
-            <w:r>
-              <w:rPr>
-                <w:b/>
-                <w:color w:val="31594F"/>
-                <w:sz w:val="19"/>
-              </w:rPr>
-              <w:t>09  点头致意</w:t>
-            </w:r>
-          </w:p>
-        </w:tc>
-      </w:tr>
-      <w:tr>
-        <w:trPr>
-          <w:cantSplit/>
-        </w:trPr>
-        <w:tc>
-          <w:tcPr>
-            <w:tcW w:type="dxa" w:w="3254"/>
-            <w:vAlign w:val="center"/>
-            <w:shd w:fill="FBF9F4" w:val="clear"/>
-          </w:tcPr>
-          <w:p>
-            <w:pPr>
-              <w:spacing w:before="40" w:after="40"/>
-              <w:jc w:val="center"/>
-            </w:pPr>
-            <w:r>
-              <w:drawing>
-                <wp:inline xmlns:a="http://schemas.openxmlformats.org/drawingml/2006/main" xmlns:pic="http://schemas.openxmlformats.org/drawingml/2006/picture">
-                  <wp:extent cx="1748238" cy="1691640"/>
-                  <wp:docPr id="14" name="Picture 14" title="10 整理头发" descr="PetForge 示例桌宠动作：整理头发。"/>
-                  <wp:cNvGraphicFramePr>
-                    <a:graphicFrameLocks noChangeAspect="1"/>
-                  </wp:cNvGraphicFramePr>
-                  <a:graphic>
-                    <a:graphicData uri="http://schemas.openxmlformats.org/drawingml/2006/picture">
-                      <pic:pic>
-                        <pic:nvPicPr>
-                          <pic:cNvPr id="0" name="hair-touch.png"/>
-                          <pic:cNvPicPr/>
-                        </pic:nvPicPr>
-                        <pic:blipFill>
-                          <a:blip r:embed="rId23"/>
-                          <a:stretch>
-                            <a:fillRect/>
-                          </a:stretch>
-                        </pic:blipFill>
-                        <pic:spPr>
-                          <a:xfrm>
-                            <a:off x="0" y="0"/>
-                            <a:ext cx="1748238" cy="1691640"/>
-                          </a:xfrm>
-                          <a:prstGeom prst="rect"/>
-                        </pic:spPr>
-                      </pic:pic>
-                    </a:graphicData>
-                  </a:graphic>
-                </wp:inline>
-              </w:drawing>
-            </w:r>
-          </w:p>
-          <w:p>
-            <w:pPr>
-              <w:spacing w:before="20" w:after="80"/>
-              <w:jc w:val="center"/>
-            </w:pPr>
-            <w:r>
-              <w:rPr>
-                <w:b/>
-                <w:color w:val="31594F"/>
-                <w:sz w:val="19"/>
-              </w:rPr>
-              <w:t>10  整理头发</w:t>
-            </w:r>
-          </w:p>
-        </w:tc>
-        <w:tc>
-          <w:tcPr>
-            <w:tcW w:type="dxa" w:w="3254"/>
-            <w:vAlign w:val="center"/>
-            <w:shd w:fill="FBF9F4" w:val="clear"/>
-          </w:tcPr>
-          <w:p>
-            <w:pPr>
-              <w:spacing w:before="40" w:after="40"/>
-              <w:jc w:val="center"/>
-            </w:pPr>
-            <w:r>
-              <w:drawing>
-                <wp:inline xmlns:a="http://schemas.openxmlformats.org/drawingml/2006/main" xmlns:pic="http://schemas.openxmlformats.org/drawingml/2006/picture">
-                  <wp:extent cx="1748238" cy="1691640"/>
-                  <wp:docPr id="15" name="Picture 15" title="11 照镜子" descr="PetForge 示例桌宠动作：照镜子。"/>
-                  <wp:cNvGraphicFramePr>
-                    <a:graphicFrameLocks noChangeAspect="1"/>
-                  </wp:cNvGraphicFramePr>
-                  <a:graphic>
-                    <a:graphicData uri="http://schemas.openxmlformats.org/drawingml/2006/picture">
-                      <pic:pic>
-                        <pic:nvPicPr>
-                          <pic:cNvPr id="0" name="mirror.png"/>
-                          <pic:cNvPicPr/>
-                        </pic:nvPicPr>
-                        <pic:blipFill>
-                          <a:blip r:embed="rId24"/>
-                          <a:stretch>
-                            <a:fillRect/>
-                          </a:stretch>
-                        </pic:blipFill>
-                        <pic:spPr>
-                          <a:xfrm>
-                            <a:off x="0" y="0"/>
-                            <a:ext cx="1748238" cy="1691640"/>
-                          </a:xfrm>
-                          <a:prstGeom prst="rect"/>
-                        </pic:spPr>
-                      </pic:pic>
-                    </a:graphicData>
-                  </a:graphic>
-                </wp:inline>
-              </w:drawing>
-            </w:r>
-          </w:p>
-          <w:p>
-            <w:pPr>
-              <w:spacing w:before="20" w:after="80"/>
-              <w:jc w:val="center"/>
-            </w:pPr>
-            <w:r>
-              <w:rPr>
-                <w:b/>
-                <w:color w:val="31594F"/>
-                <w:sz w:val="19"/>
-              </w:rPr>
-              <w:t>11  照镜子</w:t>
-            </w:r>
-          </w:p>
-        </w:tc>
-        <w:tc>
-          <w:tcPr>
-            <w:tcW w:type="dxa" w:w="3254"/>
-            <w:vAlign w:val="center"/>
-            <w:shd w:fill="FBF9F4" w:val="clear"/>
-          </w:tcPr>
-          <w:p>
-            <w:pPr>
-              <w:spacing w:before="40" w:after="40"/>
-              <w:jc w:val="center"/>
-            </w:pPr>
-            <w:r>
-              <w:drawing>
-                <wp:inline xmlns:a="http://schemas.openxmlformats.org/drawingml/2006/main" xmlns:pic="http://schemas.openxmlformats.org/drawingml/2006/picture">
-                  <wp:extent cx="1748238" cy="1691640"/>
-                  <wp:docPr id="16" name="Picture 16" title="12 托腮思考" descr="PetForge 示例桌宠动作：托腮思考。"/>
-                  <wp:cNvGraphicFramePr>
-                    <a:graphicFrameLocks noChangeAspect="1"/>
-                  </wp:cNvGraphicFramePr>
-                  <a:graphic>
-                    <a:graphicData uri="http://schemas.openxmlformats.org/drawingml/2006/picture">
-                      <pic:pic>
-                        <pic:nvPicPr>
-                          <pic:cNvPr id="0" name="think.png"/>
-                          <pic:cNvPicPr/>
-                        </pic:nvPicPr>
-                        <pic:blipFill>
-                          <a:blip r:embed="rId25"/>
-                          <a:stretch>
-                            <a:fillRect/>
-                          </a:stretch>
-                        </pic:blipFill>
-                        <pic:spPr>
-                          <a:xfrm>
-                            <a:off x="0" y="0"/>
-                            <a:ext cx="1748238" cy="1691640"/>
-                          </a:xfrm>
-                          <a:prstGeom prst="rect"/>
-                        </pic:spPr>
-                      </pic:pic>
-                    </a:graphicData>
-                  </a:graphic>
-                </wp:inline>
-              </w:drawing>
-            </w:r>
-          </w:p>
-          <w:p>
-            <w:pPr>
-              <w:spacing w:before="20" w:after="80"/>
-              <w:jc w:val="center"/>
-            </w:pPr>
-            <w:r>
-              <w:rPr>
-                <w:b/>
-                <w:color w:val="31594F"/>
-                <w:sz w:val="19"/>
-              </w:rPr>
-              <w:t>12  托腮思考</w:t>
-            </w:r>
-          </w:p>
-        </w:tc>
-      </w:tr>
-    </w:tbl>
-    <w:p>
-      <w:r>
-        <w:br w:type="page"/>
-      </w:r>
-    </w:p>
-    <w:p>
-      <w:pPr>
-        <w:pStyle w:val="3"/>
-      </w:pPr>
-      <w:r>
-        <w:t>动作图册三：表情、舒展和手机互动</w:t>
-      </w:r>
-    </w:p>
-    <w:p>
-      <w:pPr>
-        <w:spacing w:after="160"/>
-      </w:pPr>
-      <w:r>
-        <w:t>包括张望、摸脸、轻笑、送心和蹲下玩手机。</w:t>
-      </w:r>
-    </w:p>
-    <w:tbl>
-      <w:tblPr>
-        <w:tblW w:type="auto" w:w="0"/>
-        <w:jc w:val="center"/>
-        <w:tblLayout w:type="fixed"/>
-        <w:tblLook w:firstColumn="1" w:firstRow="1" w:lastColumn="0" w:lastRow="0" w:noHBand="0" w:noVBand="1" w:val="04A0"/>
-        <w:tblBorders>
-          <w:top w:val="single" w:sz="5" w:space="0" w:color="E0DAD2"/>
-          <w:left w:val="single" w:sz="5" w:space="0" w:color="E0DAD2"/>
-          <w:bottom w:val="single" w:sz="5" w:space="0" w:color="E0DAD2"/>
-          <w:right w:val="single" w:sz="5" w:space="0" w:color="E0DAD2"/>
-          <w:insideH w:val="single" w:sz="5" w:space="0" w:color="E0DAD2"/>
-          <w:insideV w:val="single" w:sz="5" w:space="0" w:color="E0DAD2"/>
-        </w:tblBorders>
-      </w:tblPr>
-      <w:tblGrid>
-        <w:gridCol w:w="3254"/>
-        <w:gridCol w:w="3254"/>
-        <w:gridCol w:w="3254"/>
-      </w:tblGrid>
-      <w:tr>
-        <w:trPr>
-          <w:cantSplit/>
-        </w:trPr>
-        <w:tc>
-          <w:tcPr>
-            <w:tcW w:type="dxa" w:w="3254"/>
-            <w:vAlign w:val="center"/>
-            <w:shd w:fill="FBF9F4" w:val="clear"/>
-          </w:tcPr>
-          <w:p>
-            <w:pPr>
-              <w:spacing w:before="40" w:after="40"/>
-              <w:jc w:val="center"/>
-            </w:pPr>
-            <w:r>
-              <w:drawing>
-                <wp:inline xmlns:a="http://schemas.openxmlformats.org/drawingml/2006/main" xmlns:pic="http://schemas.openxmlformats.org/drawingml/2006/picture">
-                  <wp:extent cx="1748238" cy="1691640"/>
-                  <wp:docPr id="17" name="Picture 17" title="13 左右张望" descr="PetForge 示例桌宠动作：左右张望。"/>
-                  <wp:cNvGraphicFramePr>
-                    <a:graphicFrameLocks noChangeAspect="1"/>
-                  </wp:cNvGraphicFramePr>
-                  <a:graphic>
-                    <a:graphicData uri="http://schemas.openxmlformats.org/drawingml/2006/picture">
-                      <pic:pic>
-                        <pic:nvPicPr>
-                          <pic:cNvPr id="0" name="look.png"/>
-                          <pic:cNvPicPr/>
-                        </pic:nvPicPr>
-                        <pic:blipFill>
-                          <a:blip r:embed="rId26"/>
-                          <a:stretch>
-                            <a:fillRect/>
-                          </a:stretch>
-                        </pic:blipFill>
-                        <pic:spPr>
-                          <a:xfrm>
-                            <a:off x="0" y="0"/>
-                            <a:ext cx="1748238" cy="1691640"/>
-                          </a:xfrm>
-                          <a:prstGeom prst="rect"/>
-                        </pic:spPr>
-                      </pic:pic>
-                    </a:graphicData>
-                  </a:graphic>
-                </wp:inline>
-              </w:drawing>
-            </w:r>
-          </w:p>
-          <w:p>
-            <w:pPr>
-              <w:spacing w:before="20" w:after="80"/>
-              <w:jc w:val="center"/>
-            </w:pPr>
-            <w:r>
-              <w:rPr>
-                <w:b/>
-                <w:color w:val="31594F"/>
-                <w:sz w:val="19"/>
-              </w:rPr>
-              <w:t>13  左右张望</w:t>
-            </w:r>
-          </w:p>
-        </w:tc>
-        <w:tc>
-          <w:tcPr>
-            <w:tcW w:type="dxa" w:w="3254"/>
-            <w:vAlign w:val="center"/>
-            <w:shd w:fill="FBF9F4" w:val="clear"/>
-          </w:tcPr>
-          <w:p>
-            <w:pPr>
-              <w:spacing w:before="40" w:after="40"/>
-              <w:jc w:val="center"/>
-            </w:pPr>
-            <w:r>
-              <w:drawing>
-                <wp:inline xmlns:a="http://schemas.openxmlformats.org/drawingml/2006/main" xmlns:pic="http://schemas.openxmlformats.org/drawingml/2006/picture">
-                  <wp:extent cx="1748238" cy="1691640"/>
-                  <wp:docPr id="18" name="Picture 18" title="14 害羞摸脸" descr="PetForge 示例桌宠动作：害羞摸脸。"/>
-                  <wp:cNvGraphicFramePr>
-                    <a:graphicFrameLocks noChangeAspect="1"/>
-                  </wp:cNvGraphicFramePr>
-                  <a:graphic>
-                    <a:graphicData uri="http://schemas.openxmlformats.org/drawingml/2006/picture">
-                      <pic:pic>
-                        <pic:nvPicPr>
-                          <pic:cNvPr id="0" name="shy-face.png"/>
-                          <pic:cNvPicPr/>
-                        </pic:nvPicPr>
-                        <pic:blipFill>
-                          <a:blip r:embed="rId27"/>
-                          <a:stretch>
-                            <a:fillRect/>
-                          </a:stretch>
-                        </pic:blipFill>
-                        <pic:spPr>
-                          <a:xfrm>
-                            <a:off x="0" y="0"/>
-                            <a:ext cx="1748238" cy="1691640"/>
-                          </a:xfrm>
-                          <a:prstGeom prst="rect"/>
-                        </pic:spPr>
-                      </pic:pic>
-                    </a:graphicData>
-                  </a:graphic>
-                </wp:inline>
-              </w:drawing>
-            </w:r>
-          </w:p>
-          <w:p>
-            <w:pPr>
-              <w:spacing w:before="20" w:after="80"/>
-              <w:jc w:val="center"/>
-            </w:pPr>
-            <w:r>
-              <w:rPr>
-                <w:b/>
-                <w:color w:val="31594F"/>
-                <w:sz w:val="19"/>
-              </w:rPr>
-              <w:t>14  害羞摸脸</w:t>
-            </w:r>
-          </w:p>
-        </w:tc>
-        <w:tc>
-          <w:tcPr>
-            <w:tcW w:type="dxa" w:w="3254"/>
-            <w:vAlign w:val="center"/>
-            <w:shd w:fill="FBF9F4" w:val="clear"/>
-          </w:tcPr>
-          <w:p>
-            <w:pPr>
-              <w:spacing w:before="40" w:after="40"/>
-              <w:jc w:val="center"/>
-            </w:pPr>
-            <w:r>
-              <w:drawing>
-                <wp:inline xmlns:a="http://schemas.openxmlformats.org/drawingml/2006/main" xmlns:pic="http://schemas.openxmlformats.org/drawingml/2006/picture">
-                  <wp:extent cx="1748238" cy="1691640"/>
-                  <wp:docPr id="19" name="Picture 19" title="15 抬手舒展" descr="PetForge 示例桌宠动作：抬手舒展。"/>
-                  <wp:cNvGraphicFramePr>
-                    <a:graphicFrameLocks noChangeAspect="1"/>
-                  </wp:cNvGraphicFramePr>
-                  <a:graphic>
-                    <a:graphicData uri="http://schemas.openxmlformats.org/drawingml/2006/picture">
-                      <pic:pic>
-                        <pic:nvPicPr>
-                          <pic:cNvPr id="0" name="stretch.png"/>
-                          <pic:cNvPicPr/>
-                        </pic:nvPicPr>
-                        <pic:blipFill>
-                          <a:blip r:embed="rId28"/>
-                          <a:stretch>
-                            <a:fillRect/>
-                          </a:stretch>
-                        </pic:blipFill>
-                        <pic:spPr>
-                          <a:xfrm>
-                            <a:off x="0" y="0"/>
-                            <a:ext cx="1748238" cy="1691640"/>
-                          </a:xfrm>
-                          <a:prstGeom prst="rect"/>
-                        </pic:spPr>
-                      </pic:pic>
-                    </a:graphicData>
-                  </a:graphic>
-                </wp:inline>
-              </w:drawing>
-            </w:r>
-          </w:p>
-          <w:p>
-            <w:pPr>
-              <w:spacing w:before="20" w:after="80"/>
-              <w:jc w:val="center"/>
-            </w:pPr>
-            <w:r>
-              <w:rPr>
-                <w:b/>
-                <w:color w:val="31594F"/>
-                <w:sz w:val="19"/>
-              </w:rPr>
-              <w:t>15  抬手舒展</w:t>
-            </w:r>
-          </w:p>
-        </w:tc>
-      </w:tr>
-      <w:tr>
-        <w:trPr>
-          <w:cantSplit/>
-        </w:trPr>
-        <w:tc>
-          <w:tcPr>
-            <w:tcW w:type="dxa" w:w="3254"/>
-            <w:vAlign w:val="center"/>
-            <w:shd w:fill="FBF9F4" w:val="clear"/>
-          </w:tcPr>
-          <w:p>
-            <w:pPr>
-              <w:spacing w:before="40" w:after="40"/>
-              <w:jc w:val="center"/>
-            </w:pPr>
-            <w:r>
-              <w:drawing>
-                <wp:inline xmlns:a="http://schemas.openxmlformats.org/drawingml/2006/main" xmlns:pic="http://schemas.openxmlformats.org/drawingml/2006/picture">
-                  <wp:extent cx="1748238" cy="1691640"/>
-                  <wp:docPr id="20" name="Picture 20" title="16 捂嘴轻笑" descr="PetForge 示例桌宠动作：捂嘴轻笑。"/>
-                  <wp:cNvGraphicFramePr>
-                    <a:graphicFrameLocks noChangeAspect="1"/>
-                  </wp:cNvGraphicFramePr>
-                  <a:graphic>
-                    <a:graphicData uri="http://schemas.openxmlformats.org/drawingml/2006/picture">
-                      <pic:pic>
-                        <pic:nvPicPr>
-                          <pic:cNvPr id="0" name="covered-laugh.png"/>
-                          <pic:cNvPicPr/>
-                        </pic:nvPicPr>
-                        <pic:blipFill>
-                          <a:blip r:embed="rId29"/>
-                          <a:stretch>
-                            <a:fillRect/>
-                          </a:stretch>
-                        </pic:blipFill>
-                        <pic:spPr>
-                          <a:xfrm>
-                            <a:off x="0" y="0"/>
-                            <a:ext cx="1748238" cy="1691640"/>
-                          </a:xfrm>
-                          <a:prstGeom prst="rect"/>
-                        </pic:spPr>
-                      </pic:pic>
-                    </a:graphicData>
-                  </a:graphic>
-                </wp:inline>
-              </w:drawing>
-            </w:r>
-          </w:p>
-          <w:p>
-            <w:pPr>
-              <w:spacing w:before="20" w:after="80"/>
-              <w:jc w:val="center"/>
-            </w:pPr>
-            <w:r>
-              <w:rPr>
-                <w:b/>
-                <w:color w:val="31594F"/>
-                <w:sz w:val="19"/>
-              </w:rPr>
-              <w:t>16  捂嘴轻笑</w:t>
-            </w:r>
-          </w:p>
-        </w:tc>
-        <w:tc>
-          <w:tcPr>
-            <w:tcW w:type="dxa" w:w="3254"/>
-            <w:vAlign w:val="center"/>
-            <w:shd w:fill="FBF9F4" w:val="clear"/>
-          </w:tcPr>
-          <w:p>
-            <w:pPr>
-              <w:spacing w:before="40" w:after="40"/>
-              <w:jc w:val="center"/>
-            </w:pPr>
-            <w:r>
-              <w:drawing>
-                <wp:inline xmlns:a="http://schemas.openxmlformats.org/drawingml/2006/main" xmlns:pic="http://schemas.openxmlformats.org/drawingml/2006/picture">
-                  <wp:extent cx="1748238" cy="1691640"/>
-                  <wp:docPr id="21" name="Picture 21" title="17 送出小爱心" descr="PetForge 示例桌宠动作：送出小爱心。"/>
-                  <wp:cNvGraphicFramePr>
-                    <a:graphicFrameLocks noChangeAspect="1"/>
-                  </wp:cNvGraphicFramePr>
-                  <a:graphic>
-                    <a:graphicData uri="http://schemas.openxmlformats.org/drawingml/2006/picture">
-                      <pic:pic>
-                        <pic:nvPicPr>
-                          <pic:cNvPr id="0" name="heart.png"/>
-                          <pic:cNvPicPr/>
-                        </pic:nvPicPr>
-                        <pic:blipFill>
-                          <a:blip r:embed="rId30"/>
-                          <a:stretch>
-                            <a:fillRect/>
-                          </a:stretch>
-                        </pic:blipFill>
-                        <pic:spPr>
-                          <a:xfrm>
-                            <a:off x="0" y="0"/>
-                            <a:ext cx="1748238" cy="1691640"/>
-                          </a:xfrm>
-                          <a:prstGeom prst="rect"/>
-                        </pic:spPr>
-                      </pic:pic>
-                    </a:graphicData>
-                  </a:graphic>
-                </wp:inline>
-              </w:drawing>
-            </w:r>
-          </w:p>
-          <w:p>
-            <w:pPr>
-              <w:spacing w:before="20" w:after="80"/>
-              <w:jc w:val="center"/>
-            </w:pPr>
-            <w:r>
-              <w:rPr>
-                <w:b/>
-                <w:color w:val="31594F"/>
-                <w:sz w:val="19"/>
-              </w:rPr>
-              <w:t>17  送出小爱心</w:t>
-            </w:r>
-          </w:p>
-        </w:tc>
-        <w:tc>
-          <w:tcPr>
-            <w:tcW w:type="dxa" w:w="3254"/>
-            <w:vAlign w:val="center"/>
-            <w:shd w:fill="FBF9F4" w:val="clear"/>
-          </w:tcPr>
-          <w:p>
-            <w:pPr>
-              <w:spacing w:before="40" w:after="40"/>
-              <w:jc w:val="center"/>
-            </w:pPr>
-            <w:r>
-              <w:drawing>
-                <wp:inline xmlns:a="http://schemas.openxmlformats.org/drawingml/2006/main" xmlns:pic="http://schemas.openxmlformats.org/drawingml/2006/picture">
-                  <wp:extent cx="1748238" cy="1691640"/>
-                  <wp:docPr id="22" name="Picture 22" title="18 蹲下玩手机（点按与滑动）" descr="PetForge 示例桌宠动作：蹲下玩手机（点按与滑动）。"/>
-                  <wp:cNvGraphicFramePr>
-                    <a:graphicFrameLocks noChangeAspect="1"/>
-                  </wp:cNvGraphicFramePr>
-                  <a:graphic>
-                    <a:graphicData uri="http://schemas.openxmlformats.org/drawingml/2006/picture">
-                      <pic:pic>
-                        <pic:nvPicPr>
-                          <pic:cNvPr id="0" name="phone.png"/>
-                          <pic:cNvPicPr/>
-                        </pic:nvPicPr>
-                        <pic:blipFill>
-                          <a:blip r:embed="rId31"/>
-                          <a:stretch>
-                            <a:fillRect/>
-                          </a:stretch>
-                        </pic:blipFill>
-                        <pic:spPr>
-                          <a:xfrm>
-                            <a:off x="0" y="0"/>
-                            <a:ext cx="1748238" cy="1691640"/>
-                          </a:xfrm>
-                          <a:prstGeom prst="rect"/>
-                        </pic:spPr>
-                      </pic:pic>
-                    </a:graphicData>
-                  </a:graphic>
-                </wp:inline>
-              </w:drawing>
-            </w:r>
-          </w:p>
-          <w:p>
-            <w:pPr>
-              <w:spacing w:before="20" w:after="80"/>
-              <w:jc w:val="center"/>
-            </w:pPr>
-            <w:r>
-              <w:rPr>
-                <w:b/>
-                <w:color w:val="31594F"/>
-                <w:sz w:val="19"/>
-              </w:rPr>
-              <w:t>18  蹲下玩手机（点按与滑动）</w:t>
-            </w:r>
-          </w:p>
-        </w:tc>
-      </w:tr>
-    </w:tbl>
     <w:sectPr>
       <w:headerReference r:id="rId5" w:type="default"/>
       <w:footerReference r:id="rId6" w:type="default"/>

</xml_diff>